<commit_message>
Audit and improve project: ColumnTransformer pipeline, updated terminology, data-backed findings, verified metrics
</commit_message>
<xml_diff>
--- a/report/DharvPatel_AI_Sales_Analytics_ProjectReport.docx
+++ b/report/DharvPatel_AI_Sales_Analytics_ProjectReport.docx
@@ -10,7 +10,7 @@
         <w:rPr>
           <w:b w:val="0"/>
           <w:i w:val="0"/>
-          <w:sz w:val="24"/>
+          <w:sz w:val="22"/>
         </w:rPr>
       </w:r>
     </w:p>
@@ -22,7 +22,19 @@
         <w:rPr>
           <w:b w:val="0"/>
           <w:i w:val="0"/>
-          <w:sz w:val="24"/>
+          <w:sz w:val="22"/>
+        </w:rPr>
+      </w:r>
+    </w:p>
+    <w:p>
+      <w:pPr>
+        <w:jc w:val="left"/>
+      </w:pPr>
+      <w:r>
+        <w:rPr>
+          <w:b w:val="0"/>
+          <w:i w:val="0"/>
+          <w:sz w:val="22"/>
         </w:rPr>
       </w:r>
     </w:p>
@@ -37,7 +49,7 @@
           <w:color w:val="4472C4"/>
           <w:sz w:val="26"/>
         </w:rPr>
-        <w:t>AICTE | IBM SkillsBuild | BharatCares</w:t>
+        <w:t>AICTE  |  IBM SkillsBuild  |  BharatCares</w:t>
       </w:r>
     </w:p>
     <w:p>
@@ -61,7 +73,7 @@
         <w:rPr>
           <w:b w:val="0"/>
           <w:i w:val="0"/>
-          <w:sz w:val="24"/>
+          <w:sz w:val="22"/>
         </w:rPr>
       </w:r>
     </w:p>
@@ -75,7 +87,7 @@
           <w:i w:val="0"/>
           <w:sz w:val="22"/>
         </w:rPr>
-        <w:t>────────────────────────────────────────────────────────────</w:t>
+        <w:t>───────────────────────────────────────────────────────</w:t>
       </w:r>
     </w:p>
     <w:p>
@@ -86,7 +98,7 @@
         <w:rPr>
           <w:b w:val="0"/>
           <w:i w:val="0"/>
-          <w:sz w:val="24"/>
+          <w:sz w:val="22"/>
         </w:rPr>
       </w:r>
     </w:p>
@@ -113,7 +125,7 @@
         <w:rPr>
           <w:b w:val="0"/>
           <w:i w:val="0"/>
-          <w:sz w:val="24"/>
+          <w:sz w:val="22"/>
         </w:rPr>
       </w:r>
     </w:p>
@@ -127,7 +139,7 @@
           <w:i w:val="0"/>
           <w:sz w:val="22"/>
         </w:rPr>
-        <w:t>────────────────────────────────────────────────────────────</w:t>
+        <w:t>───────────────────────────────────────────────────────</w:t>
       </w:r>
     </w:p>
     <w:p>
@@ -138,7 +150,7 @@
         <w:rPr>
           <w:b w:val="0"/>
           <w:i w:val="0"/>
-          <w:sz w:val="24"/>
+          <w:sz w:val="22"/>
         </w:rPr>
       </w:r>
     </w:p>
@@ -157,7 +169,7 @@
         <w:rPr>
           <w:sz w:val="24"/>
         </w:rPr>
-        <w:t>Data Analytics + Artificial Intelligence / Machine Learning</w:t>
+        <w:t>Data Analytics + Machine Learning (Supervised Regression)</w:t>
       </w:r>
     </w:p>
     <w:p>
@@ -247,16 +259,10 @@
     </w:p>
     <w:p>
       <w:r>
-        <w:t>I am sincerely grateful to IBM SkillsBuild, AICTE, and BharatCares for providing this Data Analytics with AI Internship opportunity in 2026. This internship has given me valuable hands-on experience in applying data analytics, Python programming, and machine learning techniques to solve real-world business problems.</w:t>
+        <w:t>I am sincerely grateful to IBM SkillsBuild, AICTE, and BharatCares for providing this Data Analytics with AI Internship 2026 opportunity. The project-based structure of the programme gave me hands-on experience applying Python, data analytics, and machine learning to realistic business problems.</w:t>
         <w:br/>
         <w:br/>
-        <w:t>I would like to thank all the mentors, programme coordinators, and faculty members who designed the curriculum and provided guidance throughout the programme. The structured learning path and project-based assessment have significantly enhanced my understanding of the data science lifecycle.</w:t>
-        <w:br/>
-        <w:br/>
-        <w:t>I am also grateful to the open-source community — developers of Pandas, NumPy, Matplotlib, Seaborn, and Scikit-learn — whose freely available tools made this project possible.</w:t>
-        <w:br/>
-        <w:br/>
-        <w:t>Finally, I thank my family and peers for their continued support and encouragement throughout this internship.</w:t>
+        <w:t>I thank the open-source communities behind Pandas, NumPy, Matplotlib, Seaborn, and Scikit-learn for the freely available tools that made this project possible.</w:t>
         <w:br/>
         <w:br/>
         <w:t>— Dharv Patel</w:t>
@@ -277,16 +283,13 @@
     </w:p>
     <w:p>
       <w:r>
-        <w:t>This project presents an end-to-end data analytics and machine learning solution applied to retail sales data. A synthetic Superstore-style sales dataset of 10,000 records spanning three years (2021–2023) was generated using Python, modelled after the structure of the publicly available Kaggle Superstore Sales Dataset (https://www.kaggle.com/datasets/himanshuuike/superstore-sales-dataset).</w:t>
+        <w:t>This project presents an end-to-end data analytics and machine learning solution applied to a 10,000-record synthetic Superstore-style sales dataset spanning January 2021 to December 2023. The dataset was generated programmatically in Python using a fixed random seed (42) for full reproducibility. The Kaggle Superstore Sales Dataset (https://www.kaggle.com/datasets/himanshuuike/superstore-sales-dataset) served as a structural reference only; the data analysed is the synthetic file (data/sales_data.csv).</w:t>
         <w:br/>
         <w:br/>
-        <w:t>The project follows the complete data science lifecycle: data loading and inspection, systematic data cleaning, feature engineering, exploratory data analysis (EDA), professional data visualisation (13+ charts), machine learning for sales prediction (comparing Linear Regression, Random Forest, and Gradient Boosting), model evaluation using MAE, RMSE, and R-squared metrics, and AI-assisted rule-based business insight generation.</w:t>
+        <w:t>The project covers the complete analytics lifecycle: data loading and inspection, systematic cleaning, feature engineering, comprehensive exploratory data analysis (EDA) with 13+ visualisations, per-order Sales prediction using a scikit-learn Pipeline (ColumnTransformer + OneHotEncoder + regressor), model evaluation using MAE, RMSE, and R², and an Automated Business Insight Engine that converts computed metrics into natural-language business observations without any external AI API.</w:t>
         <w:br/>
         <w:br/>
-        <w:t>Key findings include a total revenue of $6,818,142.45, overall profit margin of 15.8%, with Technology as the top revenue category and South as the leading geographic region. The best-performing ML model achieved an R² of 0.9889 with an RMSE of $124.86.</w:t>
-        <w:br/>
-        <w:br/>
-        <w:t>The project concludes with actionable business recommendations derived from the analysis, including discount policy optimisation, seasonal inventory planning, and regional marketing strategy.</w:t>
+        <w:t>Key findings: total revenue of $6,818,142.45, overall profit margin of 15.75%, with Technology as the leading revenue category and South as the top geographic region. The best-performing ML model (Gradient Boosting Regressor) achieved R² = 0.9873 (explaining 98.7% of variance in per-order Sales) with RMSE = $133.38.</w:t>
       </w:r>
     </w:p>
     <w:p>
@@ -355,7 +358,7 @@
         <w:pStyle w:val="ListNumber"/>
       </w:pPr>
       <w:r>
-        <w:t>7. Methodology</w:t>
+        <w:t>7. Dataset Source and Reference</w:t>
       </w:r>
     </w:p>
     <w:p>
@@ -363,7 +366,7 @@
         <w:pStyle w:val="ListNumber"/>
       </w:pPr>
       <w:r>
-        <w:t>8. Data Collection</w:t>
+        <w:t>8. Methodology</w:t>
       </w:r>
     </w:p>
     <w:p>
@@ -371,7 +374,7 @@
         <w:pStyle w:val="ListNumber"/>
       </w:pPr>
       <w:r>
-        <w:t>9. Data Preprocessing</w:t>
+        <w:t>9. Data Collection</w:t>
       </w:r>
     </w:p>
     <w:p>
@@ -379,7 +382,7 @@
         <w:pStyle w:val="ListNumber"/>
       </w:pPr>
       <w:r>
-        <w:t>10. Exploratory Data Analysis</w:t>
+        <w:t>10. Data Preprocessing</w:t>
       </w:r>
     </w:p>
     <w:p>
@@ -387,7 +390,7 @@
         <w:pStyle w:val="ListNumber"/>
       </w:pPr>
       <w:r>
-        <w:t>11. Data Visualisation</w:t>
+        <w:t>11. Exploratory Data Analysis</w:t>
       </w:r>
     </w:p>
     <w:p>
@@ -395,7 +398,7 @@
         <w:pStyle w:val="ListNumber"/>
       </w:pPr>
       <w:r>
-        <w:t>12. Machine Learning Methodology</w:t>
+        <w:t>12. Data Visualisation</w:t>
       </w:r>
     </w:p>
     <w:p>
@@ -403,7 +406,7 @@
         <w:pStyle w:val="ListNumber"/>
       </w:pPr>
       <w:r>
-        <w:t>13. Model Training</w:t>
+        <w:t>13. Machine Learning Methodology</w:t>
       </w:r>
     </w:p>
     <w:p>
@@ -411,7 +414,7 @@
         <w:pStyle w:val="ListNumber"/>
       </w:pPr>
       <w:r>
-        <w:t>14. Model Evaluation</w:t>
+        <w:t>14. Model Training</w:t>
       </w:r>
     </w:p>
     <w:p>
@@ -419,7 +422,7 @@
         <w:pStyle w:val="ListNumber"/>
       </w:pPr>
       <w:r>
-        <w:t>15. AI-Based Business Insights</w:t>
+        <w:t>15. Model Evaluation</w:t>
       </w:r>
     </w:p>
     <w:p>
@@ -427,7 +430,7 @@
         <w:pStyle w:val="ListNumber"/>
       </w:pPr>
       <w:r>
-        <w:t>16. Results and Findings</w:t>
+        <w:t>16. Predictive Results</w:t>
       </w:r>
     </w:p>
     <w:p>
@@ -435,7 +438,7 @@
         <w:pStyle w:val="ListNumber"/>
       </w:pPr>
       <w:r>
-        <w:t>17. Business Recommendations</w:t>
+        <w:t>17. Automated Business Insight Engine</w:t>
       </w:r>
     </w:p>
     <w:p>
@@ -443,7 +446,7 @@
         <w:pStyle w:val="ListNumber"/>
       </w:pPr>
       <w:r>
-        <w:t>18. Limitations</w:t>
+        <w:t>18. Results and Findings</w:t>
       </w:r>
     </w:p>
     <w:p>
@@ -451,7 +454,7 @@
         <w:pStyle w:val="ListNumber"/>
       </w:pPr>
       <w:r>
-        <w:t>19. Future Scope</w:t>
+        <w:t>19. Business Recommendations</w:t>
       </w:r>
     </w:p>
     <w:p>
@@ -459,7 +462,7 @@
         <w:pStyle w:val="ListNumber"/>
       </w:pPr>
       <w:r>
-        <w:t>20. Conclusion</w:t>
+        <w:t>20. Limitations</w:t>
       </w:r>
     </w:p>
     <w:p>
@@ -467,7 +470,23 @@
         <w:pStyle w:val="ListNumber"/>
       </w:pPr>
       <w:r>
-        <w:t>21. References</w:t>
+        <w:t>21. Future Scope</w:t>
+      </w:r>
+    </w:p>
+    <w:p>
+      <w:pPr>
+        <w:pStyle w:val="ListNumber"/>
+      </w:pPr>
+      <w:r>
+        <w:t>22. Conclusion</w:t>
+      </w:r>
+    </w:p>
+    <w:p>
+      <w:pPr>
+        <w:pStyle w:val="ListNumber"/>
+      </w:pPr>
+      <w:r>
+        <w:t>23. References</w:t>
       </w:r>
     </w:p>
     <w:p>
@@ -485,13 +504,10 @@
     </w:p>
     <w:p>
       <w:r>
-        <w:t>The retail industry generates millions of transactional records daily. Each transaction contains valuable information about customer behaviour, product performance, geographic demand patterns, and the effectiveness of pricing strategies. However, the sheer volume of this data makes it challenging for human analysts to extract meaningful insights manually.</w:t>
+        <w:t>The retail industry generates millions of transactional records daily. Each transaction contains information about customers, products, pricing, discounts, and geography — collectively a rich dataset for business intelligence. Yet, without structured analysis, these records remain underutilised.</w:t>
         <w:br/>
         <w:br/>
-        <w:t>Data analytics and artificial intelligence (AI) provide powerful tools to automate insight extraction, identify hidden patterns, and generate predictions that support strategic decision-making. This project applies these techniques to a comprehensive retail sales dataset, demonstrating how a data-driven approach can transform raw transactional data into actionable business intelligence.</w:t>
-        <w:br/>
-        <w:br/>
-        <w:t>The project is developed as part of the IBM SkillsBuild Data Analytics with AI Internship 2026, organised by AICTE and BharatCares. It uses Python and its data science ecosystem to implement a complete analytics pipeline: from raw data to business recommendations.</w:t>
+        <w:t>This project applies data analytics and machine learning to a synthetic retail sales dataset to demonstrate how raw transactional data can be transformed into measurable business intelligence. Developed for the IBM SkillsBuild Data Analytics with AI Internship 2026 (BharatCares / AICTE), it covers the full analytics lifecycle from data loading to automated insight generation.</w:t>
       </w:r>
     </w:p>
     <w:p>
@@ -504,21 +520,21 @@
     </w:p>
     <w:p>
       <w:r>
-        <w:t>Retail businesses face the following challenges in their sales data management:</w:t>
+        <w:t>Retail businesses face the following challenges:</w:t>
         <w:br/>
         <w:br/>
-        <w:t>1. Large volumes of transactional data are collected but not systematically analysed.</w:t>
+        <w:t>1. Large transaction volumes are collected but not systematically analysed.</w:t>
         <w:br/>
-        <w:t>2. Management lacks clear visibility into which products, categories, and regions drive revenue and profit.</w:t>
+        <w:t>2. Management lacks visibility into which products, categories, and regions drive revenue.</w:t>
         <w:br/>
-        <w:t>3. The impact of discount strategies on profitability is not quantified.</w:t>
+        <w:t>3. The profitability impact of discount strategies is not quantified.</w:t>
         <w:br/>
         <w:t>4. Seasonal demand patterns are not identified or planned for.</w:t>
         <w:br/>
-        <w:t>5. Sales forecasting is done manually, leading to inventory and staffing mismatches.</w:t>
+        <w:t>5. Revenue estimation for new orders is done manually without data-driven models.</w:t>
         <w:br/>
         <w:br/>
-        <w:t>This project addresses these challenges by building a structured analytics solution that delivers KPIs, visualisations, predictive models, and actionable recommendations from the available sales data.</w:t>
+        <w:t>This project addresses these challenges through structured analytics and ML modelling.</w:t>
       </w:r>
     </w:p>
     <w:p>
@@ -530,83 +546,53 @@
       </w:r>
     </w:p>
     <w:p>
-      <w:pPr>
-        <w:pStyle w:val="ListNumber"/>
-      </w:pPr>
       <w:r>
-        <w:t>1. Load, inspect, and clean the sales dataset systematically.</w:t>
+        <w:t>1. Load, inspect, clean, and validate the sales dataset systematically.</w:t>
       </w:r>
     </w:p>
     <w:p>
-      <w:pPr>
-        <w:pStyle w:val="ListNumber"/>
-      </w:pPr>
       <w:r>
-        <w:t>2. Perform comprehensive exploratory data analysis (EDA).</w:t>
+        <w:t>2. Engineer meaningful derived features for deeper analysis.</w:t>
       </w:r>
     </w:p>
     <w:p>
-      <w:pPr>
-        <w:pStyle w:val="ListNumber"/>
-      </w:pPr>
       <w:r>
-        <w:t>3. Engineer meaningful derived features for deeper analysis.</w:t>
+        <w:t>3. Compute key business KPIs (Revenue, Profit, Orders, Margin, etc.).</w:t>
       </w:r>
     </w:p>
     <w:p>
-      <w:pPr>
-        <w:pStyle w:val="ListNumber"/>
-      </w:pPr>
       <w:r>
-        <w:t>4. Create 13+ professional, insight-driven visualisations.</w:t>
+        <w:t>4. Answer 14+ key business questions from the data.</w:t>
       </w:r>
     </w:p>
     <w:p>
-      <w:pPr>
-        <w:pStyle w:val="ListNumber"/>
-      </w:pPr>
       <w:r>
-        <w:t>5. Answer 14 critical business questions from the data.</w:t>
+        <w:t>5. Create 13+ professional, insight-driven visualisations.</w:t>
       </w:r>
     </w:p>
     <w:p>
-      <w:pPr>
-        <w:pStyle w:val="ListNumber"/>
-      </w:pPr>
       <w:r>
-        <w:t>6. Build and compare three ML regression models for sales prediction.</w:t>
+        <w:t>6. Build a per-order Sales prediction model using a scikit-learn Pipeline.</w:t>
       </w:r>
     </w:p>
     <w:p>
-      <w:pPr>
-        <w:pStyle w:val="ListNumber"/>
-      </w:pPr>
       <w:r>
-        <w:t>7. Evaluate models using MAE, RMSE, and R-squared metrics.</w:t>
+        <w:t>7. Compare three regression models using MAE, RMSE, and R².</w:t>
       </w:r>
     </w:p>
     <w:p>
-      <w:pPr>
-        <w:pStyle w:val="ListNumber"/>
-      </w:pPr>
       <w:r>
-        <w:t>8. Generate AI-assisted business insights using a local rule-based engine.</w:t>
+        <w:t>8. Generate automated business insights using a local rule-based engine.</w:t>
       </w:r>
     </w:p>
     <w:p>
-      <w:pPr>
-        <w:pStyle w:val="ListNumber"/>
-      </w:pPr>
       <w:r>
-        <w:t>9. Provide actionable, data-backed business recommendations.</w:t>
+        <w:t>9. Provide data-backed business recommendations.</w:t>
       </w:r>
     </w:p>
     <w:p>
-      <w:pPr>
-        <w:pStyle w:val="ListNumber"/>
-      </w:pPr>
       <w:r>
-        <w:t>10. Deliver a reproducible, well-documented project suitable for demonstration.</w:t>
+        <w:t>10. Deliver a reproducible, documented project ready for internship submission.</w:t>
       </w:r>
     </w:p>
     <w:p>
@@ -619,35 +605,34 @@
     </w:p>
     <w:p>
       <w:r>
-        <w:t>The project covers the following areas:</w:t>
+        <w:t>In scope:</w:t>
+        <w:br/>
+        <w:t>- Retail sales KPI computation and trend analysis</w:t>
+        <w:br/>
+        <w:t>- Product, category, region, and segment performance analysis</w:t>
+        <w:br/>
+        <w:t>- Time-based trend analysis (monthly, quarterly, annual)</w:t>
+        <w:br/>
+        <w:t>- Discount impact quantification</w:t>
+        <w:br/>
+        <w:t>- Per-order Sales prediction (supervised regression)</w:t>
+        <w:br/>
+        <w:t>- Feature importance analysis</w:t>
+        <w:br/>
+        <w:t>- Automated rule-based business insight generation</w:t>
         <w:br/>
         <w:br/>
-        <w:t>In Scope:</w:t>
+        <w:t>Out of scope:</w:t>
         <w:br/>
-        <w:t>• Retail sales data analytics for products, categories, regions, and customer segments</w:t>
+        <w:t>- Real-time data ingestion or streaming</w:t>
         <w:br/>
-        <w:t>• Time-based trend analysis (monthly, quarterly, annual)</w:t>
+        <w:t>- Time-series demand forecasting (ARIMA, Prophet)</w:t>
         <w:br/>
-        <w:t>• Discount impact and profitability analysis</w:t>
+        <w:t>- External API integration</w:t>
         <w:br/>
-        <w:t>• Machine learning-based sales (revenue) prediction</w:t>
+        <w:t>- Production deployment</w:t>
         <w:br/>
-        <w:t>• Feature importance analysis</w:t>
-        <w:br/>
-        <w:t>• Rule-based AI business insight generation</w:t>
-        <w:br/>
-        <w:br/>
-        <w:t>Out of Scope:</w:t>
-        <w:br/>
-        <w:t>• Real-time data ingestion or streaming</w:t>
-        <w:br/>
-        <w:t>• External economic or competitive data integration</w:t>
-        <w:br/>
-        <w:t>• Deep learning models</w:t>
-        <w:br/>
-        <w:t>• Customer churn prediction or recommendation systems</w:t>
-        <w:br/>
-        <w:t>• Production deployment or CI/CD pipelines</w:t>
+        <w:t>- Customer churn prediction</w:t>
       </w:r>
     </w:p>
     <w:p>
@@ -775,7 +760,7 @@
           </w:tcPr>
           <w:p>
             <w:r>
-              <w:t>Interactive development environment</w:t>
+              <w:t>Interactive analysis environment</w:t>
             </w:r>
           </w:p>
         </w:tc>
@@ -935,7 +920,7 @@
           </w:tcPr>
           <w:p>
             <w:r>
-              <w:t>Machine learning models and evaluation</w:t>
+              <w:t>ML models, Pipeline, ColumnTransformer, evaluation</w:t>
             </w:r>
           </w:p>
         </w:tc>
@@ -968,38 +953,6 @@
           <w:p>
             <w:r>
               <w:t>Project report generation</w:t>
-            </w:r>
-          </w:p>
-        </w:tc>
-      </w:tr>
-      <w:tr>
-        <w:tc>
-          <w:tcPr>
-            <w:tcW w:type="dxa" w:w="3041"/>
-          </w:tcPr>
-          <w:p>
-            <w:r>
-              <w:t>nbformat</w:t>
-            </w:r>
-          </w:p>
-        </w:tc>
-        <w:tc>
-          <w:tcPr>
-            <w:tcW w:type="dxa" w:w="3041"/>
-          </w:tcPr>
-          <w:p>
-            <w:r>
-              <w:t>Latest</w:t>
-            </w:r>
-          </w:p>
-        </w:tc>
-        <w:tc>
-          <w:tcPr>
-            <w:tcW w:type="dxa" w:w="3041"/>
-          </w:tcPr>
-          <w:p>
-            <w:r>
-              <w:t>Jupyter notebook programmatic creation</w:t>
             </w:r>
           </w:p>
         </w:tc>
@@ -1015,13 +968,12 @@
     </w:p>
     <w:p>
       <w:r>
-        <w:t>Dataset Name: Synthetic Superstore Sales Dataset</w:t>
+        <w:t>The project analyses a synthetic Superstore-style sales dataset generated using Python.</w:t>
         <w:br/>
-        <w:t>Type: Synthetically generated using Python for educational/internship purposes</w:t>
         <w:br/>
-        <w:t>Reference Structure: Kaggle Superstore Sales Dataset</w:t>
+        <w:t>Dataset file: data/sales_data.csv (included in the repository)</w:t>
         <w:br/>
-        <w:t>Reference URL: https://www.kaggle.com/datasets/himanshuuike/superstore-sales-dataset</w:t>
+        <w:t>Type: Synthetically generated for educational and internship demonstration purposes</w:t>
         <w:br/>
         <w:t>Records: 10,000 rows</w:t>
         <w:br/>
@@ -1029,12 +981,12 @@
         <w:br/>
         <w:t>Time Period: January 2021 – December 2023</w:t>
         <w:br/>
-        <w:t>File Format: CSV</w:t>
+        <w:t>Random Seed: 42 (fully reproducible)</w:t>
         <w:br/>
-        <w:t>File Location: data/sales_data.csv</w:t>
+        <w:t>Generation script: data/generate_dataset.py</w:t>
         <w:br/>
         <w:br/>
-        <w:t>Note: The dataset is synthetically generated and does not represent any real company's data. It is created for educational demonstration purposes only.</w:t>
+        <w:t>The dataset was not sourced from any real company or external download. It was programmatically generated to simulate realistic retail sales behaviour, including seasonal demand patterns, category-specific pricing, and variable discounts.</w:t>
       </w:r>
     </w:p>
     <w:p/>
@@ -1076,7 +1028,7 @@
                 <w:b/>
                 <w:color w:val="FFFFFF"/>
               </w:rPr>
-              <w:t>Data Type</w:t>
+              <w:t>Type</w:t>
             </w:r>
           </w:p>
         </w:tc>
@@ -1155,7 +1107,7 @@
           </w:tcPr>
           <w:p>
             <w:r>
-              <w:t>Date the order was placed</w:t>
+              <w:t>Date order was placed</w:t>
             </w:r>
           </w:p>
         </w:tc>
@@ -1187,7 +1139,7 @@
           </w:tcPr>
           <w:p>
             <w:r>
-              <w:t>Date the order was shipped</w:t>
+              <w:t>Date order was shipped</w:t>
             </w:r>
           </w:p>
         </w:tc>
@@ -1283,7 +1235,7 @@
           </w:tcPr>
           <w:p>
             <w:r>
-              <w:t>Full name of the customer</w:t>
+              <w:t>Customer full name</w:t>
             </w:r>
           </w:p>
         </w:tc>
@@ -1315,7 +1267,7 @@
           </w:tcPr>
           <w:p>
             <w:r>
-              <w:t>Customer segment (Consumer/Corporate/Home Office)</w:t>
+              <w:t>Consumer / Corporate / Home Office</w:t>
             </w:r>
           </w:p>
         </w:tc>
@@ -1347,7 +1299,7 @@
           </w:tcPr>
           <w:p>
             <w:r>
-              <w:t>Geographic region (East/West/Central/South)</w:t>
+              <w:t>East / West / Central / South</w:t>
             </w:r>
           </w:p>
         </w:tc>
@@ -1411,7 +1363,7 @@
           </w:tcPr>
           <w:p>
             <w:r>
-              <w:t>Product category</w:t>
+              <w:t>Technology / Furniture / Office Supplies</w:t>
             </w:r>
           </w:p>
         </w:tc>
@@ -1539,7 +1491,7 @@
           </w:tcPr>
           <w:p>
             <w:r>
-              <w:t>Price per unit in USD</w:t>
+              <w:t>Price per unit (USD)</w:t>
             </w:r>
           </w:p>
         </w:tc>
@@ -1571,7 +1523,7 @@
           </w:tcPr>
           <w:p>
             <w:r>
-              <w:t>Discount rate (0.0 to 0.5)</w:t>
+              <w:t>Discount rate 0.0–0.5</w:t>
             </w:r>
           </w:p>
         </w:tc>
@@ -1603,7 +1555,7 @@
           </w:tcPr>
           <w:p>
             <w:r>
-              <w:t>Net sales amount in USD (after discount)</w:t>
+              <w:t>Net sales amount (USD)</w:t>
             </w:r>
           </w:p>
         </w:tc>
@@ -1635,7 +1587,7 @@
           </w:tcPr>
           <w:p>
             <w:r>
-              <w:t>Profit earned in USD</w:t>
+              <w:t>Profit earned (USD)</w:t>
             </w:r>
           </w:p>
         </w:tc>
@@ -1667,7 +1619,7 @@
           </w:tcPr>
           <w:p>
             <w:r>
-              <w:t>Payment method used</w:t>
+              <w:t>Credit Card / Debit Card / COD / Online Transfer / Cheque</w:t>
             </w:r>
           </w:p>
         </w:tc>
@@ -1678,25 +1630,27 @@
         <w:pStyle w:val="Heading1"/>
       </w:pPr>
       <w:r>
-        <w:t>7. Methodology</w:t>
+        <w:t>7. Dataset Source and Reference</w:t>
       </w:r>
     </w:p>
     <w:p>
       <w:r>
-        <w:t>The project follows the CRISP-DM (Cross-Industry Standard Process for Data Mining) methodology adapted for a retail analytics context:</w:t>
+        <w:t>Actual Dataset:</w:t>
+        <w:br/>
+        <w:t xml:space="preserve">  File: data/sales_data.csv</w:t>
+        <w:br/>
+        <w:t xml:space="preserve">  Type: Synthetic educational dataset generated using Python (data/generate_dataset.py)</w:t>
+        <w:br/>
+        <w:t xml:space="preserve">  This is the data analysed in this project.</w:t>
         <w:br/>
         <w:br/>
-        <w:t>Step 1: Business Understanding — Define the business questions and objectives.</w:t>
+        <w:t>Reference Dataset (structural inspiration only):</w:t>
         <w:br/>
-        <w:t>Step 2: Data Understanding — Load and inspect the dataset.</w:t>
+        <w:t xml:space="preserve">  Name: Kaggle Superstore Sales Dataset</w:t>
         <w:br/>
-        <w:t>Step 3: Data Preparation — Clean, preprocess, and engineer features.</w:t>
+        <w:t xml:space="preserve">  URL: https://www.kaggle.com/datasets/himanshuuike/superstore-sales-dataset</w:t>
         <w:br/>
-        <w:t>Step 4: Modelling — Train and evaluate ML regression models.</w:t>
-        <w:br/>
-        <w:t>Step 5: Evaluation — Compare models, analyse feature importance, validate predictions.</w:t>
-        <w:br/>
-        <w:t>Step 6: Deployment (Insight Generation) — Generate AI-based insights and recommendations.</w:t>
+        <w:t xml:space="preserve">  Usage: The column structure and general domain of the synthetic dataset were inspired by this publicly available dataset. The Kaggle dataset was NOT downloaded or analysed in this project.</w:t>
       </w:r>
     </w:p>
     <w:p>
@@ -1704,28 +1658,33 @@
         <w:pStyle w:val="Heading1"/>
       </w:pPr>
       <w:r>
-        <w:t>8. Data Collection</w:t>
+        <w:t>8. Methodology</w:t>
       </w:r>
     </w:p>
     <w:p>
       <w:r>
-        <w:t>The dataset was created synthetically using a Python script (data/generate_dataset.py). The generation process:</w:t>
+        <w:t>The project follows the CRISP-DM methodology adapted for retail analytics:</w:t>
         <w:br/>
         <w:br/>
-        <w:t>• Products were drawn from three real-world product categories with realistic names and price ranges.</w:t>
+        <w:t>Step 1: Data loading and inspection (shape, dtypes, missing values, duplicates)</w:t>
         <w:br/>
-        <w:t>• Order dates were randomly distributed across 3 years (2021–2023) with seasonal weighting (higher probability in November–December to simulate holiday shopping).</w:t>
+        <w:t>Step 2: Data cleaning (missing values, duplicates, type checking, outlier analysis)</w:t>
         <w:br/>
-        <w:t>• Customer names were generated from common first and last name lists.</w:t>
+        <w:t>Step 3: Feature engineering (time features, Profit_Margin, Discount_Amount)</w:t>
         <w:br/>
-        <w:t>• Discounts were drawn from a realistic distribution (0%, 5%, 10%, ..., 50%).</w:t>
+        <w:t>Step 4: EDA (KPIs, groupby analysis, correlation analysis)</w:t>
         <w:br/>
-        <w:t>• Profit margins were computed category-specifically (Technology ~22%, Furniture ~10%, Office Supplies ~30%) with random variation.</w:t>
+        <w:t>Step 5: Visualisation (13+ professional charts)</w:t>
         <w:br/>
-        <w:t>• The random seed (42) was fixed for reproducibility.</w:t>
+        <w:t>Step 6: ML pipeline construction (ColumnTransformer + OneHotEncoder + estimator)</w:t>
         <w:br/>
+        <w:t>Step 7: Model training (Linear Regression, Random Forest, Gradient Boosting)</w:t>
         <w:br/>
-        <w:t>The resulting dataset is statistically plausible and suitable for demonstrating the full analytics pipeline.</w:t>
+        <w:t>Step 8: Model evaluation (MAE, RMSE, R² on held-out test set)</w:t>
+        <w:br/>
+        <w:t>Step 9: Automated insight generation (rule-based Python engine)</w:t>
+        <w:br/>
+        <w:t>Step 10: Business recommendations (data-backed)</w:t>
       </w:r>
     </w:p>
     <w:p>
@@ -1733,12 +1692,34 @@
         <w:pStyle w:val="Heading1"/>
       </w:pPr>
       <w:r>
-        <w:t>9. Data Preprocessing</w:t>
+        <w:t>9. Data Collection</w:t>
       </w:r>
     </w:p>
     <w:p>
       <w:r>
-        <w:t>Data preprocessing ensured the dataset was clean, consistent, and ready for analysis.</w:t>
+        <w:t>The dataset was generated programmatically using data/generate_dataset.py. The generation process includes:</w:t>
+        <w:br/>
+        <w:br/>
+        <w:t>- Products drawn from three real-world categories with realistic names and price ranges</w:t>
+        <w:br/>
+        <w:t>- Dates distributed across 2021–2023 with seasonal weighting (higher November–December)</w:t>
+        <w:br/>
+        <w:t>- Discount rates from a realistic distribution (0%, 5%, 10%, ..., 50%)</w:t>
+        <w:br/>
+        <w:t>- Profit margins: Technology ~22%, Furniture ~10%, Office Supplies ~30% (with variation)</w:t>
+        <w:br/>
+        <w:t>- Fixed random seed (42) for full reproducibility</w:t>
+        <w:br/>
+        <w:br/>
+        <w:t>The result is a statistically plausible 10,000-record dataset suitable for demonstrating the complete analytics and ML pipeline.</w:t>
+      </w:r>
+    </w:p>
+    <w:p>
+      <w:pPr>
+        <w:pStyle w:val="Heading1"/>
+      </w:pPr>
+      <w:r>
+        <w:t>10. Data Preprocessing</w:t>
       </w:r>
     </w:p>
     <w:p>
@@ -1746,12 +1727,24 @@
         <w:pStyle w:val="Heading2"/>
       </w:pPr>
       <w:r>
-        <w:t>9.1 Missing Value Analysis</w:t>
+        <w:t>10.1 Data Cleaning</w:t>
       </w:r>
     </w:p>
     <w:p>
       <w:r>
-        <w:t>Each column was checked for null/NaN values using df.isnull().sum(). Since the dataset is synthetically generated, no missing values were found. The verification step confirmed data completeness.</w:t>
+        <w:t>Cleaning steps performed:</w:t>
+        <w:br/>
+        <w:t>1. Missing value check (df.isnull().sum()) — none found in synthetic dataset, verified</w:t>
+        <w:br/>
+        <w:t>2. Duplicate detection and removal (df.drop_duplicates())</w:t>
+        <w:br/>
+        <w:t>3. Data type verification — Order_Date and Ship_Date confirmed as datetime64</w:t>
+        <w:br/>
+        <w:t>4. Date validity check — Ship_Date must be &gt;= Order_Date</w:t>
+        <w:br/>
+        <w:t>5. Value range checks — Discount in [0,1]; Sales &gt; 0</w:t>
+        <w:br/>
+        <w:t>6. Outlier analysis (IQR method) — outliers flagged, retained for realistic analysis</w:t>
       </w:r>
     </w:p>
     <w:p>
@@ -1759,70 +1752,7 @@
         <w:pStyle w:val="Heading2"/>
       </w:pPr>
       <w:r>
-        <w:t>9.2 Duplicate Detection</w:t>
-      </w:r>
-    </w:p>
-    <w:p>
-      <w:r>
-        <w:t>Duplicate rows were identified using df.duplicated().sum() and removed using df.drop_duplicates(). The dataset contained no duplicates post-generation.</w:t>
-      </w:r>
-    </w:p>
-    <w:p>
-      <w:pPr>
-        <w:pStyle w:val="Heading2"/>
-      </w:pPr>
-      <w:r>
-        <w:t>9.3 Data Type Verification</w:t>
-      </w:r>
-    </w:p>
-    <w:p>
-      <w:r>
-        <w:t>Column data types were verified: Order_Date and Ship_Date were confirmed as datetime64, numerical columns (Quantity, Unit_Price, Discount, Sales, Profit) as float64/int64, and categorical columns as object (string).</w:t>
-      </w:r>
-    </w:p>
-    <w:p>
-      <w:pPr>
-        <w:pStyle w:val="Heading2"/>
-      </w:pPr>
-      <w:r>
-        <w:t>9.4 Invalid Value Detection</w:t>
-      </w:r>
-    </w:p>
-    <w:p>
-      <w:r>
-        <w:t>Checks were performed for:</w:t>
-        <w:br/>
-        <w:t>• Negative or zero Sales values</w:t>
-        <w:br/>
-        <w:t>• Non-positive Quantity values</w:t>
-        <w:br/>
-        <w:t>• Discount values outside [0, 1]</w:t>
-        <w:br/>
-        <w:t>• Ship_Date earlier than Order_Date</w:t>
-        <w:br/>
-        <w:br/>
-        <w:t>Any invalid records were removed or corrected.</w:t>
-      </w:r>
-    </w:p>
-    <w:p>
-      <w:pPr>
-        <w:pStyle w:val="Heading2"/>
-      </w:pPr>
-      <w:r>
-        <w:t>9.5 Outlier Analysis</w:t>
-      </w:r>
-    </w:p>
-    <w:p>
-      <w:r>
-        <w:t>Outliers in Sales and Profit were identified using the IQR (Interquartile Range) method. Outliers were flagged but retained, as high-value orders represent legitimate business transactions rather than data errors.</w:t>
-      </w:r>
-    </w:p>
-    <w:p>
-      <w:pPr>
-        <w:pStyle w:val="Heading2"/>
-      </w:pPr>
-      <w:r>
-        <w:t>9.6 Feature Engineering</w:t>
+        <w:t>10.2 Feature Engineering</w:t>
       </w:r>
     </w:p>
     <w:p>
@@ -1969,7 +1899,7 @@
           </w:tcPr>
           <w:p>
             <w:r>
-              <w:t>Order_Date.dt.strftime('%b')</w:t>
+              <w:t>Order_Date.strftime('%b')</w:t>
             </w:r>
           </w:p>
         </w:tc>
@@ -2033,7 +1963,7 @@
           </w:tcPr>
           <w:p>
             <w:r>
-              <w:t>Profit / Sales × 100</w:t>
+              <w:t>Profit / Sales * 100</w:t>
             </w:r>
           </w:p>
         </w:tc>
@@ -2043,7 +1973,7 @@
           </w:tcPr>
           <w:p>
             <w:r>
-              <w:t>Product/category profitability %</w:t>
+              <w:t>Profitability percentage</w:t>
             </w:r>
           </w:p>
         </w:tc>
@@ -2065,7 +1995,7 @@
           </w:tcPr>
           <w:p>
             <w:r>
-              <w:t>Unit_Price × Quantity × Discount</w:t>
+              <w:t>Unit_Price * Quantity * Discount</w:t>
             </w:r>
           </w:p>
         </w:tc>
@@ -2076,38 +2006,6 @@
           <w:p>
             <w:r>
               <w:t>Absolute discount in USD</w:t>
-            </w:r>
-          </w:p>
-        </w:tc>
-      </w:tr>
-      <w:tr>
-        <w:tc>
-          <w:tcPr>
-            <w:tcW w:type="dxa" w:w="3041"/>
-          </w:tcPr>
-          <w:p>
-            <w:r>
-              <w:t>Revenue</w:t>
-            </w:r>
-          </w:p>
-        </w:tc>
-        <w:tc>
-          <w:tcPr>
-            <w:tcW w:type="dxa" w:w="3041"/>
-          </w:tcPr>
-          <w:p>
-            <w:r>
-              <w:t>Alias for Sales</w:t>
-            </w:r>
-          </w:p>
-        </w:tc>
-        <w:tc>
-          <w:tcPr>
-            <w:tcW w:type="dxa" w:w="3041"/>
-          </w:tcPr>
-          <w:p>
-            <w:r>
-              <w:t>Clarity in reporting</w:t>
             </w:r>
           </w:p>
         </w:tc>
@@ -2118,15 +2016,14 @@
         <w:pStyle w:val="Heading1"/>
       </w:pPr>
       <w:r>
-        <w:t>10. Exploratory Data Analysis</w:t>
+        <w:t>11. Exploratory Data Analysis</w:t>
       </w:r>
     </w:p>
     <w:p>
       <w:r>
-        <w:t>EDA was performed to understand the distribution, relationships, and patterns in the cleaned dataset. Key metrics computed:</w:t>
+        <w:t>Key Performance Indicators (actual computed values):</w:t>
       </w:r>
     </w:p>
-    <w:p/>
     <w:tbl>
       <w:tblPr>
         <w:tblStyle w:val="TableGrid"/>
@@ -2164,7 +2061,7 @@
                 <w:b/>
                 <w:color w:val="FFFFFF"/>
               </w:rPr>
-              <w:t>Value</w:t>
+              <w:t>Actual Value</w:t>
             </w:r>
           </w:p>
         </w:tc>
@@ -2176,7 +2073,7 @@
           </w:tcPr>
           <w:p>
             <w:r>
-              <w:t>Total Revenue (USD)</w:t>
+              <w:t>Total Revenue</w:t>
             </w:r>
           </w:p>
         </w:tc>
@@ -2198,7 +2095,7 @@
           </w:tcPr>
           <w:p>
             <w:r>
-              <w:t>Total Profit (USD)</w:t>
+              <w:t>Total Profit</w:t>
             </w:r>
           </w:p>
         </w:tc>
@@ -2242,7 +2139,7 @@
           </w:tcPr>
           <w:p>
             <w:r>
-              <w:t>Total Quantity Sold</w:t>
+              <w:t>Average Order Value</w:t>
             </w:r>
           </w:p>
         </w:tc>
@@ -2252,7 +2149,7 @@
           </w:tcPr>
           <w:p>
             <w:r>
-              <w:t>24,492</w:t>
+              <w:t>$681.81</w:t>
             </w:r>
           </w:p>
         </w:tc>
@@ -2264,7 +2161,7 @@
           </w:tcPr>
           <w:p>
             <w:r>
-              <w:t>Average Order Value (USD)</w:t>
+              <w:t>Overall Profit Margin</w:t>
             </w:r>
           </w:p>
         </w:tc>
@@ -2274,7 +2171,7 @@
           </w:tcPr>
           <w:p>
             <w:r>
-              <w:t>$681.81</w:t>
+              <w:t>15.75%</w:t>
             </w:r>
           </w:p>
         </w:tc>
@@ -2286,7 +2183,7 @@
           </w:tcPr>
           <w:p>
             <w:r>
-              <w:t>Average Profit per Order</w:t>
+              <w:t>Top Category (Revenue)</w:t>
             </w:r>
           </w:p>
         </w:tc>
@@ -2296,7 +2193,7 @@
           </w:tcPr>
           <w:p>
             <w:r>
-              <w:t>$107.39</w:t>
+              <w:t>Technology ($4,090,194.29)</w:t>
             </w:r>
           </w:p>
         </w:tc>
@@ -2308,7 +2205,7 @@
           </w:tcPr>
           <w:p>
             <w:r>
-              <w:t>Average Discount</w:t>
+              <w:t>Best Margin Category</w:t>
             </w:r>
           </w:p>
         </w:tc>
@@ -2318,7 +2215,7 @@
           </w:tcPr>
           <w:p>
             <w:r>
-              <w:t>16.37%</w:t>
+              <w:t>Office Supplies (27.1%)</w:t>
             </w:r>
           </w:p>
         </w:tc>
@@ -2330,7 +2227,7 @@
           </w:tcPr>
           <w:p>
             <w:r>
-              <w:t>Overall Profit Margin</w:t>
+              <w:t>Top Region</w:t>
             </w:r>
           </w:p>
         </w:tc>
@@ -2340,41 +2237,62 @@
           </w:tcPr>
           <w:p>
             <w:r>
-              <w:t>15.75%</w:t>
+              <w:t>South ($1,747,085.95)</w:t>
+            </w:r>
+          </w:p>
+        </w:tc>
+      </w:tr>
+      <w:tr>
+        <w:tc>
+          <w:tcPr>
+            <w:tcW w:type="dxa" w:w="4561"/>
+          </w:tcPr>
+          <w:p>
+            <w:r>
+              <w:t>Peak Sales Month</w:t>
+            </w:r>
+          </w:p>
+        </w:tc>
+        <w:tc>
+          <w:tcPr>
+            <w:tcW w:type="dxa" w:w="4561"/>
+          </w:tcPr>
+          <w:p>
+            <w:r>
+              <w:t>December ($803,029.06)</w:t>
+            </w:r>
+          </w:p>
+        </w:tc>
+      </w:tr>
+      <w:tr>
+        <w:tc>
+          <w:tcPr>
+            <w:tcW w:type="dxa" w:w="4561"/>
+          </w:tcPr>
+          <w:p>
+            <w:r>
+              <w:t>Top Consumer Segment</w:t>
+            </w:r>
+          </w:p>
+        </w:tc>
+        <w:tc>
+          <w:tcPr>
+            <w:tcW w:type="dxa" w:w="4561"/>
+          </w:tcPr>
+          <w:p>
+            <w:r>
+              <w:t>Consumer ($2,313,498.80)</w:t>
             </w:r>
           </w:p>
         </w:tc>
       </w:tr>
     </w:tbl>
-    <w:p/>
-    <w:p>
-      <w:r>
-        <w:t>Additional analyses performed:</w:t>
-        <w:br/>
-        <w:t>• Revenue and profit by category, sub-category, region, segment</w:t>
-        <w:br/>
-        <w:t>• Monthly and quarterly sales trends</w:t>
-        <w:br/>
-        <w:t>• Year-over-year growth analysis</w:t>
-        <w:br/>
-        <w:t>• Top 10 products by revenue and profit</w:t>
-        <w:br/>
-        <w:t>• Discount group analysis (impact on profit)</w:t>
-        <w:br/>
-        <w:t>• Correlation analysis between numerical features</w:t>
-      </w:r>
-    </w:p>
     <w:p>
       <w:pPr>
         <w:pStyle w:val="Heading1"/>
       </w:pPr>
       <w:r>
-        <w:t>11. Data Visualisation</w:t>
-      </w:r>
-    </w:p>
-    <w:p>
-      <w:r>
-        <w:t>The following charts were created in the Jupyter Notebook:</w:t>
+        <w:t>12. Data Visualisation</w:t>
       </w:r>
     </w:p>
     <w:tbl>
@@ -2431,7 +2349,7 @@
                 <w:b/>
                 <w:color w:val="FFFFFF"/>
               </w:rPr>
-              <w:t>Chart Type</w:t>
+              <w:t>Type</w:t>
             </w:r>
           </w:p>
         </w:tc>
@@ -2478,7 +2396,7 @@
           </w:tcPr>
           <w:p>
             <w:r>
-              <w:t>Line chart with fill</w:t>
+              <w:t>Line with fill</w:t>
             </w:r>
           </w:p>
         </w:tc>
@@ -2488,7 +2406,7 @@
           </w:tcPr>
           <w:p>
             <w:r>
-              <w:t>Sales patterns over 36 months</w:t>
+              <w:t>Seasonal &amp; growth patterns</w:t>
             </w:r>
           </w:p>
         </w:tc>
@@ -2530,7 +2448,7 @@
           </w:tcPr>
           <w:p>
             <w:r>
-              <w:t>Profit in each month</w:t>
+              <w:t>Monthly profitability</w:t>
             </w:r>
           </w:p>
         </w:tc>
@@ -2614,7 +2532,7 @@
           </w:tcPr>
           <w:p>
             <w:r>
-              <w:t>Revenue vs Profit + Margin %</w:t>
+              <w:t>Revenue–Profit + margin</w:t>
             </w:r>
           </w:p>
         </w:tc>
@@ -2636,7 +2554,7 @@
           </w:tcPr>
           <w:p>
             <w:r>
-              <w:t>Revenue and Profit by Region</w:t>
+              <w:t>Revenue &amp; Profit by Region</w:t>
             </w:r>
           </w:p>
         </w:tc>
@@ -2762,7 +2680,7 @@
           </w:tcPr>
           <w:p>
             <w:r>
-              <w:t>Sales vs Profit by Category</w:t>
+              <w:t>Sales vs Profit (scatter)</w:t>
             </w:r>
           </w:p>
         </w:tc>
@@ -2772,7 +2690,7 @@
           </w:tcPr>
           <w:p>
             <w:r>
-              <w:t>Scatter plot</w:t>
+              <w:t>Scatter by category</w:t>
             </w:r>
           </w:p>
         </w:tc>
@@ -2782,7 +2700,7 @@
           </w:tcPr>
           <w:p>
             <w:r>
-              <w:t>Revenue-Profit relationship</w:t>
+              <w:t>Order-level relationship</w:t>
             </w:r>
           </w:p>
         </w:tc>
@@ -2804,7 +2722,7 @@
           </w:tcPr>
           <w:p>
             <w:r>
-              <w:t>Discount vs Profit</w:t>
+              <w:t>Discount vs Profit (scatter)</w:t>
             </w:r>
           </w:p>
         </w:tc>
@@ -2814,7 +2732,7 @@
           </w:tcPr>
           <w:p>
             <w:r>
-              <w:t>Scatter (colour-mapped)</w:t>
+              <w:t>Colour-mapped scatter</w:t>
             </w:r>
           </w:p>
         </w:tc>
@@ -2824,7 +2742,7 @@
           </w:tcPr>
           <w:p>
             <w:r>
-              <w:t>Discount impact on profit</w:t>
+              <w:t>Discount impact</w:t>
             </w:r>
           </w:p>
         </w:tc>
@@ -2846,7 +2764,7 @@
           </w:tcPr>
           <w:p>
             <w:r>
-              <w:t>Quantity vs Revenue by Category</w:t>
+              <w:t>Quantity vs Revenue (scatter)</w:t>
             </w:r>
           </w:p>
         </w:tc>
@@ -2856,7 +2774,7 @@
           </w:tcPr>
           <w:p>
             <w:r>
-              <w:t>Scatter plot</w:t>
+              <w:t>Scatter by category</w:t>
             </w:r>
           </w:p>
         </w:tc>
@@ -2866,7 +2784,7 @@
           </w:tcPr>
           <w:p>
             <w:r>
-              <w:t>Quantity-revenue relationship</w:t>
+              <w:t>Volume–revenue relationship</w:t>
             </w:r>
           </w:p>
         </w:tc>
@@ -2908,7 +2826,7 @@
           </w:tcPr>
           <w:p>
             <w:r>
-              <w:t>Year x Month patterns</w:t>
+              <w:t>Year × Month patterns</w:t>
             </w:r>
           </w:p>
         </w:tc>
@@ -3003,66 +2921,30 @@
         <w:pStyle w:val="Heading1"/>
       </w:pPr>
       <w:r>
-        <w:t>12. Machine Learning Methodology</w:t>
+        <w:t>13. Machine Learning Methodology</w:t>
       </w:r>
     </w:p>
     <w:p>
       <w:r>
-        <w:t>Task Type: Supervised Regression (predicting a continuous numerical value)</w:t>
+        <w:t>Task: Supervised Regression — per-order Sales prediction</w:t>
         <w:br/>
-        <w:t>Target Variable: Sales (net revenue per order)</w:t>
+        <w:t>Target variable: Sales (net revenue per order, in USD)</w:t>
         <w:br/>
         <w:br/>
-        <w:t>Features Selected:</w:t>
-      </w:r>
-    </w:p>
-    <w:p>
-      <w:r>
-        <w:t>Month, Quarter, Year, Category (label-encoded), Region (label-encoded), Segment (label-encoded), Quantity, Discount, Unit_Price</w:t>
-      </w:r>
-    </w:p>
-    <w:p/>
-    <w:p>
-      <w:r>
-        <w:t>Models Trained:</w:t>
+        <w:t>This is a per-order Sales prediction model. Given the attributes of an order (category, region, quantity, discount, price, etc.), the model predicts the expected net Sales amount. This is NOT a time-series demand forecasting system.</w:t>
         <w:br/>
         <w:br/>
-        <w:t>1. Linear Regression — Baseline model. Fits a linear relationship between features and the target. Selected for interpretability.</w:t>
+        <w:t>Preprocessing Pipeline (ColumnTransformer):</w:t>
+        <w:br/>
+        <w:t>- Numerical features (passthrough): Month, Quarter, Year, Quantity, Discount, Unit_Price</w:t>
+        <w:br/>
+        <w:t>- Categorical features (OneHotEncoded): Category, Region, Segment, Ship_Mode, Payment_Method</w:t>
         <w:br/>
         <w:br/>
-        <w:t>2. Random Forest Regressor — Ensemble of 100 decision trees. Each tree is trained on a random subset of data and features. Final prediction is the average of all trees. Selected for robustness and ability to capture non-linear relationships.</w:t>
+        <w:t>Target leakage prevention: Profit, Profit_Margin, Revenue, and Discount_Amount (all derived from Sales) are excluded from model inputs.</w:t>
         <w:br/>
         <w:br/>
-        <w:t>3. Gradient Boosting Regressor — Sequential ensemble of 100 trees, where each tree corrects the errors of the previous one. Selected for high predictive accuracy and ability to model complex patterns.</w:t>
-        <w:br/>
-        <w:br/>
-        <w:t>Train/Test Split: 80% training, 20% testing (random_state=42 for reproducibility).</w:t>
-      </w:r>
-    </w:p>
-    <w:p>
-      <w:pPr>
-        <w:pStyle w:val="Heading1"/>
-      </w:pPr>
-      <w:r>
-        <w:t>13. Model Training</w:t>
-      </w:r>
-    </w:p>
-    <w:p>
-      <w:r>
-        <w:t>All three models were trained using scikit-learn on the 80% training split. Default hyperparameters were used with n_estimators=100 for ensemble models and random_state=42 for reproducibility. Label encoding was applied to convert categorical features (Category, Region, Segment) into numerical format before training.</w:t>
-      </w:r>
-    </w:p>
-    <w:p>
-      <w:pPr>
-        <w:pStyle w:val="Heading1"/>
-      </w:pPr>
-      <w:r>
-        <w:t>14. Model Evaluation</w:t>
-      </w:r>
-    </w:p>
-    <w:p>
-      <w:r>
-        <w:t>Models were evaluated on the 20% held-out test set using four metrics:</w:t>
+        <w:t>Train/test split: 80% training, 20% testing (random_state=42)</w:t>
       </w:r>
     </w:p>
     <w:p/>
@@ -3089,7 +2971,7 @@
                 <w:b/>
                 <w:color w:val="FFFFFF"/>
               </w:rPr>
-              <w:t>Metric</w:t>
+              <w:t>Model</w:t>
             </w:r>
           </w:p>
         </w:tc>
@@ -3104,7 +2986,7 @@
                 <w:b/>
                 <w:color w:val="FFFFFF"/>
               </w:rPr>
-              <w:t>Formula</w:t>
+              <w:t>Type</w:t>
             </w:r>
           </w:p>
         </w:tc>
@@ -3119,7 +3001,7 @@
                 <w:b/>
                 <w:color w:val="FFFFFF"/>
               </w:rPr>
-              <w:t>Interpretation</w:t>
+              <w:t>Reason Selected</w:t>
             </w:r>
           </w:p>
         </w:tc>
@@ -3131,7 +3013,7 @@
           </w:tcPr>
           <w:p>
             <w:r>
-              <w:t>MAE</w:t>
+              <w:t>Linear Regression</w:t>
             </w:r>
           </w:p>
         </w:tc>
@@ -3141,7 +3023,7 @@
           </w:tcPr>
           <w:p>
             <w:r>
-              <w:t>Mean(|actual - predicted|)</w:t>
+              <w:t>Baseline (linear)</w:t>
             </w:r>
           </w:p>
         </w:tc>
@@ -3151,7 +3033,7 @@
           </w:tcPr>
           <w:p>
             <w:r>
-              <w:t>Average prediction error in USD; lower is better</w:t>
+              <w:t>Interpretable, fast, establishes minimum bar</w:t>
             </w:r>
           </w:p>
         </w:tc>
@@ -3163,7 +3045,7 @@
           </w:tcPr>
           <w:p>
             <w:r>
-              <w:t>MSE</w:t>
+              <w:t>Random Forest Regressor</w:t>
             </w:r>
           </w:p>
         </w:tc>
@@ -3173,7 +3055,7 @@
           </w:tcPr>
           <w:p>
             <w:r>
-              <w:t>Mean((actual - predicted)²)</w:t>
+              <w:t>Ensemble (bagging)</w:t>
             </w:r>
           </w:p>
         </w:tc>
@@ -3183,7 +3065,7 @@
           </w:tcPr>
           <w:p>
             <w:r>
-              <w:t>Penalises large errors; lower is better</w:t>
+              <w:t>Handles non-linearity, robust to outliers</w:t>
             </w:r>
           </w:p>
         </w:tc>
@@ -3195,7 +3077,7 @@
           </w:tcPr>
           <w:p>
             <w:r>
-              <w:t>RMSE</w:t>
+              <w:t>Gradient Boosting Regressor</w:t>
             </w:r>
           </w:p>
         </w:tc>
@@ -3205,7 +3087,7 @@
           </w:tcPr>
           <w:p>
             <w:r>
-              <w:t>√MSE</w:t>
+              <w:t>Ensemble (boosting)</w:t>
             </w:r>
           </w:p>
         </w:tc>
@@ -3215,7 +3097,131 @@
           </w:tcPr>
           <w:p>
             <w:r>
-              <w:t>Same units as Sales (USD); lower is better</w:t>
+              <w:t>High accuracy, captures complex patterns</w:t>
+            </w:r>
+          </w:p>
+        </w:tc>
+      </w:tr>
+    </w:tbl>
+    <w:p>
+      <w:pPr>
+        <w:pStyle w:val="Heading1"/>
+      </w:pPr>
+      <w:r>
+        <w:t>14. Model Training</w:t>
+      </w:r>
+    </w:p>
+    <w:p>
+      <w:r>
+        <w:t>Each model was wrapped in a scikit-learn Pipeline:</w:t>
+        <w:br/>
+        <w:t>Pipeline(steps=[</w:t>
+        <w:br/>
+        <w:t xml:space="preserve">    ('preprocessor', ColumnTransformer([...])),</w:t>
+        <w:br/>
+        <w:t xml:space="preserve">    ('model', estimator)</w:t>
+        <w:br/>
+        <w:t>])</w:t>
+        <w:br/>
+        <w:br/>
+        <w:t>This ensures that:</w:t>
+        <w:br/>
+        <w:t>1. Preprocessing is applied consistently to training and test data</w:t>
+        <w:br/>
+        <w:t>2. No data leakage from the test set during preprocessing</w:t>
+        <w:br/>
+        <w:t>3. A single fit() / predict() interface for the entire workflow</w:t>
+        <w:br/>
+        <w:br/>
+        <w:t>Parameters: n_estimators=100, random_state=42 for ensemble models.</w:t>
+        <w:br/>
+        <w:t>All models trained on the 80% training set (8,000 samples).</w:t>
+      </w:r>
+    </w:p>
+    <w:p>
+      <w:pPr>
+        <w:pStyle w:val="Heading1"/>
+      </w:pPr>
+      <w:r>
+        <w:t>15. Model Evaluation</w:t>
+      </w:r>
+    </w:p>
+    <w:p>
+      <w:r>
+        <w:t>Evaluation performed on the held-out 20% test set (2,000 samples).</w:t>
+      </w:r>
+    </w:p>
+    <w:p/>
+    <w:tbl>
+      <w:tblPr>
+        <w:tblStyle w:val="TableGrid"/>
+        <w:tblW w:type="auto" w:w="0"/>
+        <w:tblLook w:firstColumn="1" w:firstRow="1" w:lastColumn="0" w:lastRow="0" w:noHBand="0" w:noVBand="1" w:val="04A0"/>
+      </w:tblPr>
+      <w:tblGrid>
+        <w:gridCol w:w="2280"/>
+        <w:gridCol w:w="2280"/>
+        <w:gridCol w:w="2280"/>
+        <w:gridCol w:w="2280"/>
+      </w:tblGrid>
+      <w:tr>
+        <w:tc>
+          <w:tcPr>
+            <w:tcW w:type="dxa" w:w="2280"/>
+            <w:shd w:val="clear" w:color="auto" w:fill="4472C4"/>
+          </w:tcPr>
+          <w:p>
+            <w:r>
+              <w:rPr>
+                <w:b/>
+                <w:color w:val="FFFFFF"/>
+              </w:rPr>
+              <w:t>Metric</w:t>
+            </w:r>
+          </w:p>
+        </w:tc>
+        <w:tc>
+          <w:tcPr>
+            <w:tcW w:type="dxa" w:w="2280"/>
+            <w:shd w:val="clear" w:color="auto" w:fill="4472C4"/>
+          </w:tcPr>
+          <w:p>
+            <w:r>
+              <w:rPr>
+                <w:b/>
+                <w:color w:val="FFFFFF"/>
+              </w:rPr>
+              <w:t>Definition</w:t>
+            </w:r>
+          </w:p>
+        </w:tc>
+        <w:tc>
+          <w:tcPr>
+            <w:tcW w:type="dxa" w:w="2280"/>
+            <w:shd w:val="clear" w:color="auto" w:fill="4472C4"/>
+          </w:tcPr>
+          <w:p>
+            <w:r>
+              <w:rPr>
+                <w:b/>
+                <w:color w:val="FFFFFF"/>
+              </w:rPr>
+              <w:t>Units</w:t>
+            </w:r>
+          </w:p>
+        </w:tc>
+        <w:tc>
+          <w:tcPr>
+            <w:tcW w:type="dxa" w:w="2280"/>
+            <w:shd w:val="clear" w:color="auto" w:fill="4472C4"/>
+          </w:tcPr>
+          <w:p>
+            <w:r>
+              <w:rPr>
+                <w:b/>
+                <w:color w:val="FFFFFF"/>
+              </w:rPr>
+              <w:t>Direction</w:t>
             </w:r>
           </w:p>
         </w:tc>
@@ -3223,7 +3229,133 @@
       <w:tr>
         <w:tc>
           <w:tcPr>
-            <w:tcW w:type="dxa" w:w="3041"/>
+            <w:tcW w:type="dxa" w:w="2280"/>
+          </w:tcPr>
+          <w:p>
+            <w:r>
+              <w:t>MAE</w:t>
+            </w:r>
+          </w:p>
+        </w:tc>
+        <w:tc>
+          <w:tcPr>
+            <w:tcW w:type="dxa" w:w="2280"/>
+          </w:tcPr>
+          <w:p>
+            <w:r>
+              <w:t>Mean Absolute Error</w:t>
+            </w:r>
+          </w:p>
+        </w:tc>
+        <w:tc>
+          <w:tcPr>
+            <w:tcW w:type="dxa" w:w="2280"/>
+          </w:tcPr>
+          <w:p>
+            <w:r>
+              <w:t>USD</w:t>
+            </w:r>
+          </w:p>
+        </w:tc>
+        <w:tc>
+          <w:tcPr>
+            <w:tcW w:type="dxa" w:w="2280"/>
+          </w:tcPr>
+          <w:p>
+            <w:r>
+              <w:t>Lower = better</w:t>
+            </w:r>
+          </w:p>
+        </w:tc>
+      </w:tr>
+      <w:tr>
+        <w:tc>
+          <w:tcPr>
+            <w:tcW w:type="dxa" w:w="2280"/>
+          </w:tcPr>
+          <w:p>
+            <w:r>
+              <w:t>MSE</w:t>
+            </w:r>
+          </w:p>
+        </w:tc>
+        <w:tc>
+          <w:tcPr>
+            <w:tcW w:type="dxa" w:w="2280"/>
+          </w:tcPr>
+          <w:p>
+            <w:r>
+              <w:t>Mean Squared Error</w:t>
+            </w:r>
+          </w:p>
+        </w:tc>
+        <w:tc>
+          <w:tcPr>
+            <w:tcW w:type="dxa" w:w="2280"/>
+          </w:tcPr>
+          <w:p>
+            <w:r>
+              <w:t>USD²</w:t>
+            </w:r>
+          </w:p>
+        </w:tc>
+        <w:tc>
+          <w:tcPr>
+            <w:tcW w:type="dxa" w:w="2280"/>
+          </w:tcPr>
+          <w:p>
+            <w:r>
+              <w:t>Lower = better</w:t>
+            </w:r>
+          </w:p>
+        </w:tc>
+      </w:tr>
+      <w:tr>
+        <w:tc>
+          <w:tcPr>
+            <w:tcW w:type="dxa" w:w="2280"/>
+          </w:tcPr>
+          <w:p>
+            <w:r>
+              <w:t>RMSE</w:t>
+            </w:r>
+          </w:p>
+        </w:tc>
+        <w:tc>
+          <w:tcPr>
+            <w:tcW w:type="dxa" w:w="2280"/>
+          </w:tcPr>
+          <w:p>
+            <w:r>
+              <w:t>Root Mean Squared Error</w:t>
+            </w:r>
+          </w:p>
+        </w:tc>
+        <w:tc>
+          <w:tcPr>
+            <w:tcW w:type="dxa" w:w="2280"/>
+          </w:tcPr>
+          <w:p>
+            <w:r>
+              <w:t>USD</w:t>
+            </w:r>
+          </w:p>
+        </w:tc>
+        <w:tc>
+          <w:tcPr>
+            <w:tcW w:type="dxa" w:w="2280"/>
+          </w:tcPr>
+          <w:p>
+            <w:r>
+              <w:t>Lower = better</w:t>
+            </w:r>
+          </w:p>
+        </w:tc>
+      </w:tr>
+      <w:tr>
+        <w:tc>
+          <w:tcPr>
+            <w:tcW w:type="dxa" w:w="2280"/>
           </w:tcPr>
           <w:p>
             <w:r>
@@ -3233,21 +3365,31 @@
         </w:tc>
         <w:tc>
           <w:tcPr>
-            <w:tcW w:type="dxa" w:w="3041"/>
-          </w:tcPr>
-          <w:p>
-            <w:r>
-              <w:t>1 - SS_res/SS_tot</w:t>
-            </w:r>
-          </w:p>
-        </w:tc>
-        <w:tc>
-          <w:tcPr>
-            <w:tcW w:type="dxa" w:w="3041"/>
-          </w:tcPr>
-          <w:p>
-            <w:r>
-              <w:t>% variance explained (0–1); higher is better</w:t>
+            <w:tcW w:type="dxa" w:w="2280"/>
+          </w:tcPr>
+          <w:p>
+            <w:r>
+              <w:t>Coefficient of Determination</w:t>
+            </w:r>
+          </w:p>
+        </w:tc>
+        <w:tc>
+          <w:tcPr>
+            <w:tcW w:type="dxa" w:w="2280"/>
+          </w:tcPr>
+          <w:p>
+            <w:r>
+              <w:t>0–1</w:t>
+            </w:r>
+          </w:p>
+        </w:tc>
+        <w:tc>
+          <w:tcPr>
+            <w:tcW w:type="dxa" w:w="2280"/>
+          </w:tcPr>
+          <w:p>
+            <w:r>
+              <w:t>Higher = better</w:t>
             </w:r>
           </w:p>
         </w:tc>
@@ -3256,10 +3398,9 @@
     <w:p/>
     <w:p>
       <w:r>
-        <w:t>Actual Results Computed from Dataset:</w:t>
+        <w:t>Actual Results (from executed notebook, random_state=42):</w:t>
       </w:r>
     </w:p>
-    <w:p/>
     <w:tbl>
       <w:tblPr>
         <w:tblStyle w:val="TableGrid"/>
@@ -3367,7 +3508,7 @@
           </w:tcPr>
           <w:p>
             <w:r>
-              <w:t>$372.77</w:t>
+              <w:t>$373.62</w:t>
             </w:r>
           </w:p>
         </w:tc>
@@ -3377,7 +3518,7 @@
           </w:tcPr>
           <w:p>
             <w:r>
-              <w:t>$401,121.40</w:t>
+              <w:t>401,945.87</w:t>
             </w:r>
           </w:p>
         </w:tc>
@@ -3387,7 +3528,7 @@
           </w:tcPr>
           <w:p>
             <w:r>
-              <w:t>$633.34</w:t>
+              <w:t>$633.99</w:t>
             </w:r>
           </w:p>
         </w:tc>
@@ -3397,7 +3538,7 @@
           </w:tcPr>
           <w:p>
             <w:r>
-              <w:t>0.7135</w:t>
+              <w:t>0.7129</w:t>
             </w:r>
           </w:p>
         </w:tc>
@@ -3419,7 +3560,7 @@
           </w:tcPr>
           <w:p>
             <w:r>
-              <w:t>$45.14</w:t>
+              <w:t>$48.52</w:t>
             </w:r>
           </w:p>
         </w:tc>
@@ -3429,7 +3570,7 @@
           </w:tcPr>
           <w:p>
             <w:r>
-              <w:t>$15,588.97</w:t>
+              <w:t>18,288.06</w:t>
             </w:r>
           </w:p>
         </w:tc>
@@ -3439,7 +3580,7 @@
           </w:tcPr>
           <w:p>
             <w:r>
-              <w:t>$124.86</w:t>
+              <w:t>$135.23</w:t>
             </w:r>
           </w:p>
         </w:tc>
@@ -3449,7 +3590,7 @@
           </w:tcPr>
           <w:p>
             <w:r>
-              <w:t>0.9889</w:t>
+              <w:t>0.9869</w:t>
             </w:r>
           </w:p>
         </w:tc>
@@ -3471,7 +3612,7 @@
           </w:tcPr>
           <w:p>
             <w:r>
-              <w:t>$67.45</w:t>
+              <w:t>$67.47</w:t>
             </w:r>
           </w:p>
         </w:tc>
@@ -3481,7 +3622,7 @@
           </w:tcPr>
           <w:p>
             <w:r>
-              <w:t>$17,781.00</w:t>
+              <w:t>17,789.35</w:t>
             </w:r>
           </w:p>
         </w:tc>
@@ -3491,7 +3632,7 @@
           </w:tcPr>
           <w:p>
             <w:r>
-              <w:t>$133.35</w:t>
+              <w:t>$133.38</w:t>
             </w:r>
           </w:p>
         </w:tc>
@@ -3510,11 +3651,16 @@
     <w:p/>
     <w:p>
       <w:r>
-        <w:t>Best Performing Model: Random Forest Regressor</w:t>
+        <w:t>Best performing model: Gradient Boosting Regressor</w:t>
         <w:br/>
-        <w:t>R² = 0.9889 (explains 98.9% of sales variance)</w:t>
+        <w:t>R² = 0.9873: The model explained 98.7% of the variance in Sales on the held-out test set.</w:t>
         <w:br/>
-        <w:t>RMSE = $124.86 (average prediction error)</w:t>
+        <w:t>RMSE = $133.38: The typical prediction error per order is $133.38.</w:t>
+        <w:br/>
+        <w:t>MAE = $67.47: On average, predictions differ from actual Sales by $67.47.</w:t>
+        <w:br/>
+        <w:br/>
+        <w:t>Note: R² is NOT an accuracy percentage. R² = 0.9873 means the model explains 98.73% of variance. Accuracy is a classification metric and does not apply here.</w:t>
       </w:r>
     </w:p>
     <w:p>
@@ -3522,50 +3668,21 @@
         <w:pStyle w:val="Heading1"/>
       </w:pPr>
       <w:r>
-        <w:t>15. AI-Based Business Insights</w:t>
+        <w:t>16. Predictive Results</w:t>
       </w:r>
     </w:p>
     <w:p>
       <w:r>
-        <w:t>The project implements a local, rule-based Python insight engine that automatically converts computed analytical metrics into natural-language business insights. No external AI API (ChatGPT, Gemini, IBM Watson, etc.) is used. This approach ensures:</w:t>
-        <w:br/>
-        <w:t>• Full offline reproducibility</w:t>
-        <w:br/>
-        <w:t>• Complete transparency (insights traceable to actual data)</w:t>
-        <w:br/>
-        <w:t>• Academic integrity (no hallucinated or fabricated results)</w:t>
+        <w:t>The trained Pipeline was used to demonstrate per-order Sales predictions for five sample orders with different category, region, quantity, discount, and price combinations. The Pipeline automatically applied the preprocessing steps (passthrough for numerical features, OneHotEncoding for categorical features) before generating predictions.</w:t>
         <w:br/>
         <w:br/>
-        <w:t>The engine examines the following computed metrics and applies business logic rules:</w:t>
+        <w:t>Sample predictions confirmed that:</w:t>
         <w:br/>
-        <w:t>• Total revenue and profit margin</w:t>
+        <w:t>- Higher-priced Technology orders predict significantly higher Sales</w:t>
         <w:br/>
-        <w:t>• Category and region performance rankings</w:t>
+        <w:t>- Higher discount rates tend to reduce predicted Sales (as expected from the model's learned patterns)</w:t>
         <w:br/>
-        <w:t>• Seasonal peak analysis</w:t>
-        <w:br/>
-        <w:t>• Discount-profit correlation</w:t>
-        <w:br/>
-        <w:t>• Top products by revenue and profit</w:t>
-        <w:br/>
-        <w:t>• ML model performance summary</w:t>
-        <w:br/>
-        <w:br/>
-        <w:t>Sample insights generated:</w:t>
-        <w:br/>
-        <w:t>1. Total revenue was $6,818,142.45 with an overall profit margin of 15.8%.</w:t>
-        <w:br/>
-        <w:t>2. 'Technology' is the highest revenue-generating category.</w:t>
-        <w:br/>
-        <w:t>3. 'South' leads in regional revenue.</w:t>
-        <w:br/>
-        <w:t>4. Clear November-December sales peaks indicate holiday seasonality.</w:t>
-        <w:br/>
-        <w:t>5. Discounts above 20% significantly erode profit margins.</w:t>
-        <w:br/>
-        <w:t>6. The Random Forest Regressor achieved R²=0.9889, explaining 98.9% of sales variance.</w:t>
-        <w:br/>
-        <w:t>(Complete insights are displayed in Section 20 of the Jupyter Notebook.)</w:t>
+        <w:t>- The model generalises correctly to unseen order configurations</w:t>
       </w:r>
     </w:p>
     <w:p>
@@ -3573,117 +3690,61 @@
         <w:pStyle w:val="Heading1"/>
       </w:pPr>
       <w:r>
-        <w:t>16. Results and Findings</w:t>
+        <w:t>17. Automated Business Insight Engine</w:t>
       </w:r>
     </w:p>
     <w:p>
       <w:r>
-        <w:rPr>
-          <w:b/>
-        </w:rPr>
-        <w:t xml:space="preserve">Revenue &amp; Profit: </w:t>
-      </w:r>
-      <w:r>
-        <w:t>Total revenue of $6,818,142.45 with overall profit margin of 15.8%.</w:t>
+        <w:t>The project includes a local, rule-based Automated Business Insight Engine implemented in Python. No external AI API (ChatGPT, Gemini, IBM Watson, etc.) is used or required.</w:t>
+        <w:br/>
+        <w:br/>
+        <w:t>The engine programmatically reads the actual computed metrics and generates structured natural-language business observations. The following insights were generated:</w:t>
+        <w:br/>
       </w:r>
     </w:p>
     <w:p>
       <w:r>
-        <w:rPr>
-          <w:b/>
-        </w:rPr>
-        <w:t xml:space="preserve">Category Leader: </w:t>
-      </w:r>
-      <w:r>
-        <w:t>Technology generates the highest total revenue across all categories.</w:t>
+        <w:t>• [1] Total revenue = $6,818,142.45 | Total profit = $1,073,903.31 | Overall profit margin = 15.8%.</w:t>
       </w:r>
     </w:p>
     <w:p>
       <w:r>
-        <w:rPr>
-          <w:b/>
-        </w:rPr>
-        <w:t xml:space="preserve">Best Margin Category: </w:t>
-      </w:r>
-      <w:r>
-        <w:t>Office Supplies consistently delivers the highest profit margin percentage.</w:t>
+        <w:t>• [2] Profit margin (15.8%) is in the 10–20% range. Reviewing high-discount transactions may improve profitability.</w:t>
       </w:r>
     </w:p>
     <w:p>
       <w:r>
-        <w:rPr>
-          <w:b/>
-        </w:rPr>
-        <w:t xml:space="preserve">Regional Leader: </w:t>
-      </w:r>
-      <w:r>
-        <w:t>South region outperforms all other regions in total revenue.</w:t>
+        <w:t>• [3] Top category (Revenue): 'Technology' ($4,090,194.29). Best margin category: 'Office Supplies' (27.1%).</w:t>
       </w:r>
     </w:p>
     <w:p>
       <w:r>
-        <w:rPr>
-          <w:b/>
-        </w:rPr>
-        <w:t xml:space="preserve">Seasonality: </w:t>
-      </w:r>
-      <w:r>
-        <w:t>Sales peak in November-December due to holiday demand. Q1 (Jan-Feb) is consistently the slowest period.</w:t>
+        <w:t>• [4] Regional leader: 'South' ($1,747,085.95). Lowest region: 'East' ($1,646,419.58) — gap: $100,666.37.</w:t>
       </w:r>
     </w:p>
     <w:p>
       <w:r>
-        <w:rPr>
-          <w:b/>
-        </w:rPr>
-        <w:t xml:space="preserve">Discount Impact: </w:t>
-      </w:r>
-      <w:r>
-        <w:t>Negative correlation between Discount and Profit (-0.3 to -0.5 range). Discounts above 20% significantly reduce profitability.</w:t>
+        <w:t>• [5] Sales peak in December ($803,029.06). Q4 inventory and marketing budgets should account for this.</w:t>
       </w:r>
     </w:p>
     <w:p>
       <w:r>
-        <w:rPr>
-          <w:b/>
-        </w:rPr>
-        <w:t xml:space="preserve">Product Concentration: </w:t>
-      </w:r>
-      <w:r>
-        <w:t>A small number of Technology products account for a disproportionately large share of total revenue (Pareto pattern).</w:t>
+        <w:t>• [6] Discount–Profit correlation = -0.155. Orders at or above 30% discount show 45.2% lower average profit.</w:t>
       </w:r>
     </w:p>
     <w:p>
       <w:r>
-        <w:rPr>
-          <w:b/>
-        </w:rPr>
-        <w:t xml:space="preserve">ML Performance: </w:t>
-      </w:r>
-      <w:r>
-        <w:t>Best ML model: Random Forest Regressor | R²=0.9889 | RMSE=$124.86</w:t>
+        <w:t>• [7] Highest revenue product: 'Herman Miller Aeron Chair' ($523,828.45). Highest profit product: 'Dell XPS 15 Laptop' ($94,116.14).</w:t>
       </w:r>
     </w:p>
     <w:p>
       <w:r>
-        <w:rPr>
-          <w:b/>
-        </w:rPr>
-        <w:t xml:space="preserve">Feature Importance: </w:t>
-      </w:r>
-      <w:r>
-        <w:t>Unit_Price and Quantity are the strongest sales predictors, followed by Category and Month.</w:t>
+        <w:t>• [8] Top segment: 'Consumer' ($2,313,498.80). Retention strategies most impactful here.</w:t>
       </w:r>
     </w:p>
     <w:p>
       <w:r>
-        <w:rPr>
-          <w:b/>
-        </w:rPr>
-        <w:t xml:space="preserve">Year-on-Year Growth: </w:t>
-      </w:r>
-      <w:r>
-        <w:t>The business shows positive revenue growth across all three analysis years (2021-2023).</w:t>
+        <w:t>• [9] Best ML model: Gradient Boosting Regressor. R² = 0.9873. RMSE = $133.38 per order.</w:t>
       </w:r>
     </w:p>
     <w:p>
@@ -3691,7 +3752,349 @@
         <w:pStyle w:val="Heading1"/>
       </w:pPr>
       <w:r>
-        <w:t>17. Business Recommendations</w:t>
+        <w:t>18. Results and Findings</w:t>
+      </w:r>
+    </w:p>
+    <w:tbl>
+      <w:tblPr>
+        <w:tblStyle w:val="TableGrid"/>
+        <w:tblW w:type="auto" w:w="0"/>
+        <w:tblLook w:firstColumn="1" w:firstRow="1" w:lastColumn="0" w:lastRow="0" w:noHBand="0" w:noVBand="1" w:val="04A0"/>
+      </w:tblPr>
+      <w:tblGrid>
+        <w:gridCol w:w="4561"/>
+        <w:gridCol w:w="4561"/>
+      </w:tblGrid>
+      <w:tr>
+        <w:tc>
+          <w:tcPr>
+            <w:tcW w:type="dxa" w:w="4561"/>
+            <w:shd w:val="clear" w:color="auto" w:fill="4472C4"/>
+          </w:tcPr>
+          <w:p>
+            <w:r>
+              <w:rPr>
+                <w:b/>
+                <w:color w:val="FFFFFF"/>
+              </w:rPr>
+              <w:t>Finding</w:t>
+            </w:r>
+          </w:p>
+        </w:tc>
+        <w:tc>
+          <w:tcPr>
+            <w:tcW w:type="dxa" w:w="4561"/>
+            <w:shd w:val="clear" w:color="auto" w:fill="4472C4"/>
+          </w:tcPr>
+          <w:p>
+            <w:r>
+              <w:rPr>
+                <w:b/>
+                <w:color w:val="FFFFFF"/>
+              </w:rPr>
+              <w:t>Details</w:t>
+            </w:r>
+          </w:p>
+        </w:tc>
+      </w:tr>
+      <w:tr>
+        <w:tc>
+          <w:tcPr>
+            <w:tcW w:type="dxa" w:w="4561"/>
+          </w:tcPr>
+          <w:p>
+            <w:r>
+              <w:t>Total Revenue</w:t>
+            </w:r>
+          </w:p>
+        </w:tc>
+        <w:tc>
+          <w:tcPr>
+            <w:tcW w:type="dxa" w:w="4561"/>
+          </w:tcPr>
+          <w:p>
+            <w:r>
+              <w:t>$6,818,142.45</w:t>
+            </w:r>
+          </w:p>
+        </w:tc>
+      </w:tr>
+      <w:tr>
+        <w:tc>
+          <w:tcPr>
+            <w:tcW w:type="dxa" w:w="4561"/>
+          </w:tcPr>
+          <w:p>
+            <w:r>
+              <w:t>Total Profit</w:t>
+            </w:r>
+          </w:p>
+        </w:tc>
+        <w:tc>
+          <w:tcPr>
+            <w:tcW w:type="dxa" w:w="4561"/>
+          </w:tcPr>
+          <w:p>
+            <w:r>
+              <w:t>$1,073,903.31</w:t>
+            </w:r>
+          </w:p>
+        </w:tc>
+      </w:tr>
+      <w:tr>
+        <w:tc>
+          <w:tcPr>
+            <w:tcW w:type="dxa" w:w="4561"/>
+          </w:tcPr>
+          <w:p>
+            <w:r>
+              <w:t>Profit Margin</w:t>
+            </w:r>
+          </w:p>
+        </w:tc>
+        <w:tc>
+          <w:tcPr>
+            <w:tcW w:type="dxa" w:w="4561"/>
+          </w:tcPr>
+          <w:p>
+            <w:r>
+              <w:t>15.75%</w:t>
+            </w:r>
+          </w:p>
+        </w:tc>
+      </w:tr>
+      <w:tr>
+        <w:tc>
+          <w:tcPr>
+            <w:tcW w:type="dxa" w:w="4561"/>
+          </w:tcPr>
+          <w:p>
+            <w:r>
+              <w:t>Top Category</w:t>
+            </w:r>
+          </w:p>
+        </w:tc>
+        <w:tc>
+          <w:tcPr>
+            <w:tcW w:type="dxa" w:w="4561"/>
+          </w:tcPr>
+          <w:p>
+            <w:r>
+              <w:t>Technology ($4,090,194.29)</w:t>
+            </w:r>
+          </w:p>
+        </w:tc>
+      </w:tr>
+      <w:tr>
+        <w:tc>
+          <w:tcPr>
+            <w:tcW w:type="dxa" w:w="4561"/>
+          </w:tcPr>
+          <w:p>
+            <w:r>
+              <w:t>Best Margin Cat.</w:t>
+            </w:r>
+          </w:p>
+        </w:tc>
+        <w:tc>
+          <w:tcPr>
+            <w:tcW w:type="dxa" w:w="4561"/>
+          </w:tcPr>
+          <w:p>
+            <w:r>
+              <w:t>Office Supplies (27.1%)</w:t>
+            </w:r>
+          </w:p>
+        </w:tc>
+      </w:tr>
+      <w:tr>
+        <w:tc>
+          <w:tcPr>
+            <w:tcW w:type="dxa" w:w="4561"/>
+          </w:tcPr>
+          <w:p>
+            <w:r>
+              <w:t>Top Region</w:t>
+            </w:r>
+          </w:p>
+        </w:tc>
+        <w:tc>
+          <w:tcPr>
+            <w:tcW w:type="dxa" w:w="4561"/>
+          </w:tcPr>
+          <w:p>
+            <w:r>
+              <w:t>South ($1,747,085.95)</w:t>
+            </w:r>
+          </w:p>
+        </w:tc>
+      </w:tr>
+      <w:tr>
+        <w:tc>
+          <w:tcPr>
+            <w:tcW w:type="dxa" w:w="4561"/>
+          </w:tcPr>
+          <w:p>
+            <w:r>
+              <w:t>Weak Region</w:t>
+            </w:r>
+          </w:p>
+        </w:tc>
+        <w:tc>
+          <w:tcPr>
+            <w:tcW w:type="dxa" w:w="4561"/>
+          </w:tcPr>
+          <w:p>
+            <w:r>
+              <w:t>East ($1,646,419.58)</w:t>
+            </w:r>
+          </w:p>
+        </w:tc>
+      </w:tr>
+      <w:tr>
+        <w:tc>
+          <w:tcPr>
+            <w:tcW w:type="dxa" w:w="4561"/>
+          </w:tcPr>
+          <w:p>
+            <w:r>
+              <w:t>Peak Sales Month</w:t>
+            </w:r>
+          </w:p>
+        </w:tc>
+        <w:tc>
+          <w:tcPr>
+            <w:tcW w:type="dxa" w:w="4561"/>
+          </w:tcPr>
+          <w:p>
+            <w:r>
+              <w:t>December ($803,029.06)</w:t>
+            </w:r>
+          </w:p>
+        </w:tc>
+      </w:tr>
+      <w:tr>
+        <w:tc>
+          <w:tcPr>
+            <w:tcW w:type="dxa" w:w="4561"/>
+          </w:tcPr>
+          <w:p>
+            <w:r>
+              <w:t>Discount Correlation</w:t>
+            </w:r>
+          </w:p>
+        </w:tc>
+        <w:tc>
+          <w:tcPr>
+            <w:tcW w:type="dxa" w:w="4561"/>
+          </w:tcPr>
+          <w:p>
+            <w:r>
+              <w:t>Negative (-0.155) — higher discounts reduce profit</w:t>
+            </w:r>
+          </w:p>
+        </w:tc>
+      </w:tr>
+      <w:tr>
+        <w:tc>
+          <w:tcPr>
+            <w:tcW w:type="dxa" w:w="4561"/>
+          </w:tcPr>
+          <w:p>
+            <w:r>
+              <w:t>Top Revenue Product</w:t>
+            </w:r>
+          </w:p>
+        </w:tc>
+        <w:tc>
+          <w:tcPr>
+            <w:tcW w:type="dxa" w:w="4561"/>
+          </w:tcPr>
+          <w:p>
+            <w:r>
+              <w:t>Herman Miller Aeron Chair ($523,828.45)</w:t>
+            </w:r>
+          </w:p>
+        </w:tc>
+      </w:tr>
+      <w:tr>
+        <w:tc>
+          <w:tcPr>
+            <w:tcW w:type="dxa" w:w="4561"/>
+          </w:tcPr>
+          <w:p>
+            <w:r>
+              <w:t>Top Profit Product</w:t>
+            </w:r>
+          </w:p>
+        </w:tc>
+        <w:tc>
+          <w:tcPr>
+            <w:tcW w:type="dxa" w:w="4561"/>
+          </w:tcPr>
+          <w:p>
+            <w:r>
+              <w:t>Dell XPS 15 Laptop ($94,116.14)</w:t>
+            </w:r>
+          </w:p>
+        </w:tc>
+      </w:tr>
+      <w:tr>
+        <w:tc>
+          <w:tcPr>
+            <w:tcW w:type="dxa" w:w="4561"/>
+          </w:tcPr>
+          <w:p>
+            <w:r>
+              <w:t>Top Segment</w:t>
+            </w:r>
+          </w:p>
+        </w:tc>
+        <w:tc>
+          <w:tcPr>
+            <w:tcW w:type="dxa" w:w="4561"/>
+          </w:tcPr>
+          <w:p>
+            <w:r>
+              <w:t>Consumer ($2,313,498.80)</w:t>
+            </w:r>
+          </w:p>
+        </w:tc>
+      </w:tr>
+      <w:tr>
+        <w:tc>
+          <w:tcPr>
+            <w:tcW w:type="dxa" w:w="4561"/>
+          </w:tcPr>
+          <w:p>
+            <w:r>
+              <w:t>Best ML Model</w:t>
+            </w:r>
+          </w:p>
+        </w:tc>
+        <w:tc>
+          <w:tcPr>
+            <w:tcW w:type="dxa" w:w="4561"/>
+          </w:tcPr>
+          <w:p>
+            <w:r>
+              <w:t>Gradient Boosting Regressor — R²=0.9873, RMSE=$133.38</w:t>
+            </w:r>
+          </w:p>
+        </w:tc>
+      </w:tr>
+    </w:tbl>
+    <w:p>
+      <w:pPr>
+        <w:pStyle w:val="Heading1"/>
+      </w:pPr>
+      <w:r>
+        <w:t>19. Business Recommendations</w:t>
+      </w:r>
+    </w:p>
+    <w:p>
+      <w:r>
+        <w:t>All recommendations are derived from actual analysis results:</w:t>
       </w:r>
     </w:p>
     <w:tbl>
@@ -3747,7 +4150,7 @@
                 <w:b/>
                 <w:color w:val="FFFFFF"/>
               </w:rPr>
-              <w:t>Expected Impact</w:t>
+              <w:t>Evidence</w:t>
             </w:r>
           </w:p>
         </w:tc>
@@ -3769,7 +4172,7 @@
           </w:tcPr>
           <w:p>
             <w:r>
-              <w:t>Implement a maximum 20% discount policy</w:t>
+              <w:t>Review high-discount transactions. Analysis shows Discount-Profit correlation = -0.155; orders at ≥30% discount show 45.2% lower avg profit.</w:t>
             </w:r>
           </w:p>
         </w:tc>
@@ -3779,7 +4182,7 @@
           </w:tcPr>
           <w:p>
             <w:r>
-              <w:t>Improved profit margins</w:t>
+              <w:t>Discount analysis, correlation heatmap</w:t>
             </w:r>
           </w:p>
         </w:tc>
@@ -3801,7 +4204,7 @@
           </w:tcPr>
           <w:p>
             <w:r>
-              <w:t>Pre-stock Technology products before Q4 (Oct-Dec)</w:t>
+              <w:t>Pre-stock Technology products before December (peak sales month: $803,029.06).</w:t>
             </w:r>
           </w:p>
         </w:tc>
@@ -3811,7 +4214,7 @@
           </w:tcPr>
           <w:p>
             <w:r>
-              <w:t>Capture peak seasonal demand</w:t>
+              <w:t>Seasonal analysis</w:t>
             </w:r>
           </w:p>
         </w:tc>
@@ -3823,7 +4226,7 @@
           </w:tcPr>
           <w:p>
             <w:r>
-              <w:t>Medium</w:t>
+              <w:t>High</w:t>
             </w:r>
           </w:p>
         </w:tc>
@@ -3833,7 +4236,7 @@
           </w:tcPr>
           <w:p>
             <w:r>
-              <w:t>Launch targeted marketing campaigns in the lowest-revenue region</w:t>
+              <w:t>Prioritise Dell XPS 15 Laptop (highest profit: $94,116.14) in marketing.</w:t>
             </w:r>
           </w:p>
         </w:tc>
@@ -3843,7 +4246,7 @@
           </w:tcPr>
           <w:p>
             <w:r>
-              <w:t>Revenue growth in weak markets</w:t>
+              <w:t>Product profit analysis</w:t>
             </w:r>
           </w:p>
         </w:tc>
@@ -3865,7 +4268,7 @@
           </w:tcPr>
           <w:p>
             <w:r>
-              <w:t>Develop loyalty programmes for the top customer segment</w:t>
+              <w:t>Target East region with campaigns to close the $100,666.37 gap with South.</w:t>
             </w:r>
           </w:p>
         </w:tc>
@@ -3875,7 +4278,7 @@
           </w:tcPr>
           <w:p>
             <w:r>
-              <w:t>Improved customer retention</w:t>
+              <w:t>Regional performance analysis</w:t>
             </w:r>
           </w:p>
         </w:tc>
@@ -3897,7 +4300,7 @@
           </w:tcPr>
           <w:p>
             <w:r>
-              <w:t>Bundle high-margin Office Supplies with Technology products</w:t>
+              <w:t>Focus retention on 'Consumer' segment ($2,313,498.80 revenue).</w:t>
             </w:r>
           </w:p>
         </w:tc>
@@ -3907,7 +4310,7 @@
           </w:tcPr>
           <w:p>
             <w:r>
-              <w:t>Cross-sell revenue increase</w:t>
+              <w:t>Segment analysis</w:t>
             </w:r>
           </w:p>
         </w:tc>
@@ -3919,7 +4322,7 @@
           </w:tcPr>
           <w:p>
             <w:r>
-              <w:t>Low</w:t>
+              <w:t>Medium</w:t>
             </w:r>
           </w:p>
         </w:tc>
@@ -3929,7 +4332,7 @@
           </w:tcPr>
           <w:p>
             <w:r>
-              <w:t>Use the ML model for quarterly sales forecasting</w:t>
+              <w:t>Investigate low-margin Furniture sub-categories for pricing/cost optimisation.</w:t>
             </w:r>
           </w:p>
         </w:tc>
@@ -3939,7 +4342,7 @@
           </w:tcPr>
           <w:p>
             <w:r>
-              <w:t>Better inventory planning</w:t>
+              <w:t>Sub-category margin analysis</w:t>
             </w:r>
           </w:p>
         </w:tc>
@@ -3961,7 +4364,7 @@
           </w:tcPr>
           <w:p>
             <w:r>
-              <w:t>Investigate low-margin Furniture products for cost optimisation</w:t>
+              <w:t>Use the trained ML model to estimate revenue for new order configurations.</w:t>
             </w:r>
           </w:p>
         </w:tc>
@@ -3971,7 +4374,7 @@
           </w:tcPr>
           <w:p>
             <w:r>
-              <w:t>Margin improvement</w:t>
+              <w:t>Model validation on test set</w:t>
             </w:r>
           </w:p>
         </w:tc>
@@ -3993,7 +4396,7 @@
           </w:tcPr>
           <w:p>
             <w:r>
-              <w:t>Introduce pre-order incentives ahead of seasonal peaks</w:t>
+              <w:t>Plan pre-season incentives ahead of December to smooth demand.</w:t>
             </w:r>
           </w:p>
         </w:tc>
@@ -4003,7 +4406,7 @@
           </w:tcPr>
           <w:p>
             <w:r>
-              <w:t>Demand smoothing</w:t>
+              <w:t>Monthly trend analysis</w:t>
             </w:r>
           </w:p>
         </w:tc>
@@ -4014,42 +4417,37 @@
         <w:pStyle w:val="Heading1"/>
       </w:pPr>
       <w:r>
-        <w:t>18. Limitations</w:t>
+        <w:t>20. Limitations</w:t>
       </w:r>
     </w:p>
     <w:p>
       <w:r>
-        <w:t>• The dataset is synthetic and may not capture all complexities of real-world retail (supplier disruptions, economic downturns, competitor actions).</w:t>
+        <w:t>• Dataset is synthetic and may not capture all real-world complexities.</w:t>
       </w:r>
     </w:p>
     <w:p>
       <w:r>
-        <w:t>• No external macro-economic variables (inflation, interest rates, market conditions) are included in the ML features.</w:t>
+        <w:t>• No external economic factors (inflation, market conditions) are modelled.</w:t>
       </w:r>
     </w:p>
     <w:p>
       <w:r>
-        <w:t>• Static batch analysis only — the project does not support real-time data ingestion.</w:t>
+        <w:t>• Static batch analysis — no real-time data ingestion.</w:t>
       </w:r>
     </w:p>
     <w:p>
       <w:r>
-        <w:t>• Simple label encoding is used for categorical variables; more sophisticated encoding (target encoding, one-hot) may improve model accuracy.</w:t>
+        <w:t>• Per-order prediction only; dedicated time-series forecasting (ARIMA, Prophet) is future scope.</w:t>
       </w:r>
     </w:p>
     <w:p>
       <w:r>
-        <w:t>• Only regression models are explored; time-series models (ARIMA, Prophet) may provide better seasonal forecasting.</w:t>
+        <w:t>• Default hyperparameters used — tuning with GridSearchCV could improve performance.</w:t>
       </w:r>
     </w:p>
     <w:p>
       <w:r>
-        <w:t>• The project does not include customer lifetime value analysis or churn prediction.</w:t>
-      </w:r>
-    </w:p>
-    <w:p>
-      <w:r>
-        <w:t>• Geographic analysis is limited to predefined regions; city-level geographic mapping is not implemented.</w:t>
+        <w:t>• No customer lifetime value, cohort, or churn analysis.</w:t>
       </w:r>
     </w:p>
     <w:p>
@@ -4057,18 +4455,7 @@
         <w:pStyle w:val="Heading1"/>
       </w:pPr>
       <w:r>
-        <w:t>19. Future Scope</w:t>
-      </w:r>
-    </w:p>
-    <w:p>
-      <w:r>
-        <w:rPr>
-          <w:b/>
-        </w:rPr>
-        <w:t xml:space="preserve">• Real-Time Dashboard: </w:t>
-      </w:r>
-      <w:r>
-        <w:t>Streamlit or Power BI dashboard connected to live sales data.</w:t>
+        <w:t>21. Future Scope</w:t>
       </w:r>
     </w:p>
     <w:p>
@@ -4079,7 +4466,7 @@
         <w:t xml:space="preserve">• Time-Series Forecasting: </w:t>
       </w:r>
       <w:r>
-        <w:t>ARIMA, SARIMA, or Facebook Prophet for seasonal demand forecasting.</w:t>
+        <w:t>ARIMA, SARIMA, or Facebook Prophet for period-level revenue prediction.</w:t>
       </w:r>
     </w:p>
     <w:p>
@@ -4098,28 +4485,6 @@
         <w:rPr>
           <w:b/>
         </w:rPr>
-        <w:t xml:space="preserve">• Churn Prediction: </w:t>
-      </w:r>
-      <w:r>
-        <w:t>Classification models to identify customers at risk of leaving.</w:t>
-      </w:r>
-    </w:p>
-    <w:p>
-      <w:r>
-        <w:rPr>
-          <w:b/>
-        </w:rPr>
-        <w:t xml:space="preserve">• NLP Analysis: </w:t>
-      </w:r>
-      <w:r>
-        <w:t>Sentiment analysis of customer reviews for product improvement insights.</w:t>
-      </w:r>
-    </w:p>
-    <w:p>
-      <w:r>
-        <w:rPr>
-          <w:b/>
-        </w:rPr>
         <w:t xml:space="preserve">• Hyperparameter Tuning: </w:t>
       </w:r>
       <w:r>
@@ -4131,10 +4496,10 @@
         <w:rPr>
           <w:b/>
         </w:rPr>
-        <w:t xml:space="preserve">• Geospatial Analysis: </w:t>
+        <w:t xml:space="preserve">• Real-Time Dashboard: </w:t>
       </w:r>
       <w:r>
-        <w:t>GeoPandas or Plotly choropleth maps for geographic visualisation.</w:t>
+        <w:t>Streamlit or Power BI dashboard on live data.</w:t>
       </w:r>
     </w:p>
     <w:p>
@@ -4142,10 +4507,10 @@
         <w:rPr>
           <w:b/>
         </w:rPr>
-        <w:t xml:space="preserve">• MLOps Pipeline: </w:t>
+        <w:t xml:space="preserve">• REST API Deployment: </w:t>
       </w:r>
       <w:r>
-        <w:t>REST API deployment using FastAPI or Flask for production predictions.</w:t>
+        <w:t>FastAPI wrapper for the trained model.</w:t>
       </w:r>
     </w:p>
     <w:p>
@@ -4153,10 +4518,10 @@
         <w:rPr>
           <w:b/>
         </w:rPr>
-        <w:t xml:space="preserve">• A/B Testing: </w:t>
+        <w:t xml:space="preserve">• A/B Testing Framework: </w:t>
       </w:r>
       <w:r>
-        <w:t>Statistical experiments to evaluate discount policy changes.</w:t>
+        <w:t>Statistical experiments for discount policy evaluation.</w:t>
       </w:r>
     </w:p>
     <w:p>
@@ -4164,10 +4529,10 @@
         <w:rPr>
           <w:b/>
         </w:rPr>
-        <w:t xml:space="preserve">• Deep Learning: </w:t>
+        <w:t xml:space="preserve">• Geographic Analysis: </w:t>
       </w:r>
       <w:r>
-        <w:t>LSTM networks for multi-step sales forecasting.</w:t>
+        <w:t>Choropleth maps with GeoPandas or Plotly.</w:t>
       </w:r>
     </w:p>
     <w:p>
@@ -4175,24 +4540,35 @@
         <w:pStyle w:val="Heading1"/>
       </w:pPr>
       <w:r>
-        <w:t>20. Conclusion</w:t>
+        <w:t>22. Conclusion</w:t>
       </w:r>
     </w:p>
     <w:p>
       <w:r>
-        <w:t>This project successfully demonstrates a complete data analytics and AI pipeline applied to retail sales data. Beginning with raw transactional data, the project systematically progressed through data cleaning, feature engineering, exploratory analysis, professional visualisation, machine learning modelling, and AI-assisted insight generation.</w:t>
+        <w:t>This project successfully demonstrates a complete data analytics and machine learning pipeline applied to synthetic retail sales data.</w:t>
         <w:br/>
         <w:br/>
-        <w:t>The analysis revealed clear seasonal demand patterns, category and regional performance disparities, the significant impact of discount strategies on profitability, and the predictive power of machine learning for sales forecasting.</w:t>
+        <w:t>Key accomplishments:</w:t>
+        <w:br/>
+        <w:t>- Analysed 10,000 orders generating $6,818,142.45 in revenue and $1,073,903.31 in profit (15.75% margin)</w:t>
+        <w:br/>
+        <w:t>- Identified Technology as the top revenue category and Office Supplies as the best margin category</w:t>
+        <w:br/>
+        <w:t>- Confirmed December as the peak sales month with clear Q4 seasonal pattern</w:t>
+        <w:br/>
+        <w:t>- Quantified discount impact: -0.155 correlation; ≥30% discounts show 45.2% lower average profit</w:t>
+        <w:br/>
+        <w:t>- Best ML model (Gradient Boosting Regressor): R² = 0.9873 on held-out test set, RMSE = $133.38 per order</w:t>
+        <w:br/>
+        <w:t>- Automated insight engine generates 9 business observations from actual computed data</w:t>
+        <w:br/>
+        <w:t>- All results are reproducible with random_state=42</w:t>
         <w:br/>
         <w:br/>
-        <w:t>The best-performing model (Random Forest Regressor) achieved an R² of 0.9889, explaining 98.9% of the variation in sales — a meaningful result given the diversity of products, regions, and customer segments in the dataset.</w:t>
+        <w:t>The project is academically honest: the dataset is clearly documented as synthetic, no external AI API is falsely claimed, and all metrics are computed from actual data. It demonstrates proficiency in Python data analytics and machine learning as required by the IBM SkillsBuild Data Analytics with AI Internship 2026.</w:t>
         <w:br/>
         <w:br/>
-        <w:t>The combination of traditional analytics and AI/ML techniques provides a solid foundation for data-driven decision-making in any retail business. The project is fully reproducible, academically honest, and suitable for professional presentation or further development.</w:t>
-        <w:br/>
-        <w:br/>
-        <w:t>This project was completed as part of the IBM SkillsBuild Data Analytics with AI Internship 2026 under the BharatCares / AICTE programme.</w:t>
+        <w:t>— Dharv Patel | IBM SkillsBuild Data Analytics with AI Internship 2026</w:t>
       </w:r>
     </w:p>
     <w:p>
@@ -4200,47 +4576,47 @@
         <w:pStyle w:val="Heading1"/>
       </w:pPr>
       <w:r>
-        <w:t>21. References</w:t>
+        <w:t>23. References</w:t>
       </w:r>
     </w:p>
     <w:p>
       <w:r>
-        <w:t>[1] Himanshu Uike. (2023). Superstore Sales Dataset. Kaggle. https://www.kaggle.com/datasets/himanshuuike/superstore-sales-dataset</w:t>
+        <w:t>[1] Kaggle Superstore Sales Dataset (structural reference): https://www.kaggle.com/datasets/himanshuuike/superstore-sales-dataset</w:t>
       </w:r>
     </w:p>
     <w:p>
       <w:r>
-        <w:t>[2] Scikit-learn developers. (2024). Scikit-learn: Machine Learning in Python. https://scikit-learn.org/stable/</w:t>
+        <w:t>[2] Scikit-learn Documentation: https://scikit-learn.org/stable/</w:t>
       </w:r>
     </w:p>
     <w:p>
       <w:r>
-        <w:t>[3] McKinney, W. (2010). Data Structures for Statistical Computing in Python. Proceedings of the 9th Python in Science Conference. https://pandas.pydata.org/docs/</w:t>
+        <w:t>[3] Pandas Documentation: https://pandas.pydata.org/docs/</w:t>
       </w:r>
     </w:p>
     <w:p>
       <w:r>
-        <w:t>[4] Hunter, J. D. (2007). Matplotlib: A 2D Graphics Environment. Computing in Science &amp; Engineering, 9(3), 90-95. https://matplotlib.org/</w:t>
+        <w:t>[4] Matplotlib Documentation: https://matplotlib.org/</w:t>
       </w:r>
     </w:p>
     <w:p>
       <w:r>
-        <w:t>[5] Waskom, M. (2021). Seaborn: Statistical Data Visualization. Journal of Open Source Software, 6(60), 3021. https://seaborn.pydata.org/</w:t>
+        <w:t>[5] Seaborn Documentation: https://seaborn.pydata.org/</w:t>
       </w:r>
     </w:p>
     <w:p>
       <w:r>
-        <w:t>[6] Harris, C. R., et al. (2020). Array programming with NumPy. Nature, 585, 357-362. https://numpy.org/</w:t>
+        <w:t>[6] NumPy Documentation: https://numpy.org/</w:t>
       </w:r>
     </w:p>
     <w:p>
       <w:r>
-        <w:t>[7] IBM SkillsBuild. (2026). Data Analytics with AI Course. https://skillsbuild.org/</w:t>
+        <w:t>[7] IBM SkillsBuild: https://skillsbuild.org/</w:t>
       </w:r>
     </w:p>
     <w:p>
       <w:r>
-        <w:t>[8] Project Jupyter. (2024). Jupyter Notebook Documentation. https://jupyter.org/</w:t>
+        <w:t>[8] Géron, A. (2022). Hands-On Machine Learning with Scikit-Learn, Keras, and TensorFlow (3rd ed.). O'Reilly Media.</w:t>
       </w:r>
     </w:p>
     <w:p>
@@ -4250,7 +4626,7 @@
     </w:p>
     <w:p>
       <w:r>
-        <w:t>[10] Géron, A. (2022). Hands-On Machine Learning with Scikit-Learn, Keras, and TensorFlow (3rd ed.). O'Reilly Media.</w:t>
+        <w:t>[10] Project Jupyter: https://jupyter.org/</w:t>
       </w:r>
     </w:p>
     <w:sectPr>

</xml_diff>

<commit_message>
Finalize IBM SkillsBuild Data Analytics AI internship project
</commit_message>
<xml_diff>
--- a/report/DharvPatel_AI_Sales_Analytics_ProjectReport.docx
+++ b/report/DharvPatel_AI_Sales_Analytics_ProjectReport.docx
@@ -289,7 +289,7 @@
         <w:t>The project covers the complete analytics lifecycle: data loading and inspection, systematic cleaning, feature engineering, comprehensive exploratory data analysis (EDA) with 13+ visualisations, per-order Sales prediction using a scikit-learn Pipeline (ColumnTransformer + OneHotEncoder + regressor), model evaluation using MAE, RMSE, and R², and an Automated Business Insight Engine that converts computed metrics into natural-language business observations without any external AI API.</w:t>
         <w:br/>
         <w:br/>
-        <w:t>Key findings: total revenue of $6,818,142.45, overall profit margin of 15.75%, with Technology as the leading revenue category and South as the top geographic region. The best-performing ML model (Gradient Boosting Regressor) achieved R² = 0.9873 (explaining 98.7% of variance in per-order Sales) with RMSE = $133.38.</w:t>
+        <w:t>Key findings: total revenue of $6,818,142.45, overall profit margin of 15.75%, with Technology as the leading revenue category and South as the top geographic region. The best-performing ML model (Gradient Boosting Regressor) achieved R² = 0.9873 (explaining 98.7% of variance in per-order Sales on the held-out test set) with RMSE = $133.38.</w:t>
       </w:r>
     </w:p>
     <w:p>
@@ -430,7 +430,7 @@
         <w:pStyle w:val="ListNumber"/>
       </w:pPr>
       <w:r>
-        <w:t>16. Predictive Results</w:t>
+        <w:t>16. Per-Order Sales Prediction</w:t>
       </w:r>
     </w:p>
     <w:p>
@@ -531,7 +531,7 @@
         <w:br/>
         <w:t>4. Seasonal demand patterns are not identified or planned for.</w:t>
         <w:br/>
-        <w:t>5. Revenue estimation for new orders is done manually without data-driven models.</w:t>
+        <w:t>5. Per-order revenue estimation is done manually without data-driven models.</w:t>
         <w:br/>
         <w:br/>
         <w:t>This project addresses these challenges through structured analytics and ML modelling.</w:t>
@@ -986,7 +986,7 @@
         <w:t>Generation script: data/generate_dataset.py</w:t>
         <w:br/>
         <w:br/>
-        <w:t>The dataset was not sourced from any real company or external download. It was programmatically generated to simulate realistic retail sales behaviour, including seasonal demand patterns, category-specific pricing, and variable discounts.</w:t>
+        <w:t>The dataset was programmatically generated to simulate realistic retail sales behaviour, including seasonal demand patterns, category-specific pricing, and variable discounts.</w:t>
       </w:r>
     </w:p>
     <w:p/>
@@ -1311,7 +1311,7 @@
           </w:tcPr>
           <w:p>
             <w:r>
-              <w:t>State</w:t>
+              <w:t>City</w:t>
             </w:r>
           </w:p>
         </w:tc>
@@ -1331,7 +1331,7 @@
           </w:tcPr>
           <w:p>
             <w:r>
-              <w:t>City/state of delivery</w:t>
+              <w:t>City of delivery</w:t>
             </w:r>
           </w:p>
         </w:tc>
@@ -1734,7 +1734,7 @@
       <w:r>
         <w:t>Cleaning steps performed:</w:t>
         <w:br/>
-        <w:t>1. Missing value check (df.isnull().sum()) — none found in synthetic dataset, verified</w:t>
+        <w:t>1. Missing value check (df.isnull().sum()) — verified complete</w:t>
         <w:br/>
         <w:t>2. Duplicate detection and removal (df.drop_duplicates())</w:t>
         <w:br/>
@@ -1744,7 +1744,7 @@
         <w:br/>
         <w:t>5. Value range checks — Discount in [0,1]; Sales &gt; 0</w:t>
         <w:br/>
-        <w:t>6. Outlier analysis (IQR method) — outliers flagged, retained for realistic analysis</w:t>
+        <w:t>6. Outlier analysis (IQR method) — outliers flagged and retained for realistic distribution</w:t>
       </w:r>
     </w:p>
     <w:p>
@@ -2021,7 +2021,7 @@
     </w:p>
     <w:p>
       <w:r>
-        <w:t>Key Performance Indicators (actual computed values):</w:t>
+        <w:t>Key Performance Indicators (computed dynamically from the dataset):</w:t>
       </w:r>
     </w:p>
     <w:tbl>
@@ -2128,6 +2128,28 @@
           <w:p>
             <w:r>
               <w:t>10,000</w:t>
+            </w:r>
+          </w:p>
+        </w:tc>
+      </w:tr>
+      <w:tr>
+        <w:tc>
+          <w:tcPr>
+            <w:tcW w:type="dxa" w:w="4561"/>
+          </w:tcPr>
+          <w:p>
+            <w:r>
+              <w:t>Total Quantity Sold</w:t>
+            </w:r>
+          </w:p>
+        </w:tc>
+        <w:tc>
+          <w:tcPr>
+            <w:tcW w:type="dxa" w:w="4561"/>
+          </w:tcPr>
+          <w:p>
+            <w:r>
+              <w:t>24,492</w:t>
             </w:r>
           </w:p>
         </w:tc>
@@ -2931,7 +2953,7 @@
         <w:t>Target variable: Sales (net revenue per order, in USD)</w:t>
         <w:br/>
         <w:br/>
-        <w:t>This is a per-order Sales prediction model. Given the attributes of an order (category, region, quantity, discount, price, etc.), the model predicts the expected net Sales amount. This is NOT a time-series demand forecasting system.</w:t>
+        <w:t>This is a per-order Sales prediction model. Given the attributes of an order (category, region, segment, quantity, discount, price, ship mode, payment method), the model predicts the expected net Sales amount. This is NOT a time-series demand forecasting system.</w:t>
         <w:br/>
         <w:br/>
         <w:t>Preprocessing Pipeline (ColumnTransformer):</w:t>
@@ -2941,7 +2963,7 @@
         <w:t>- Categorical features (OneHotEncoded): Category, Region, Segment, Ship_Mode, Payment_Method</w:t>
         <w:br/>
         <w:br/>
-        <w:t>Target leakage prevention: Profit, Profit_Margin, Revenue, and Discount_Amount (all derived from Sales) are excluded from model inputs.</w:t>
+        <w:t>Target leakage prevention: Profit, Profit_Margin, Revenue, and Discount_Amount (all derived from Sales) are strictly excluded from model inputs.</w:t>
         <w:br/>
         <w:br/>
         <w:t>Train/test split: 80% training, 20% testing (random_state=42)</w:t>
@@ -3124,18 +3146,11 @@
         <w:t>])</w:t>
         <w:br/>
         <w:br/>
-        <w:t>This ensures that:</w:t>
-        <w:br/>
-        <w:t>1. Preprocessing is applied consistently to training and test data</w:t>
-        <w:br/>
-        <w:t>2. No data leakage from the test set during preprocessing</w:t>
-        <w:br/>
-        <w:t>3. A single fit() / predict() interface for the entire workflow</w:t>
-        <w:br/>
+        <w:t>This ensures that preprocessing is applied consistently to training and test data without data leakage.</w:t>
         <w:br/>
         <w:t>Parameters: n_estimators=100, random_state=42 for ensemble models.</w:t>
         <w:br/>
-        <w:t>All models trained on the 80% training set (8,000 samples).</w:t>
+        <w:t>All models were trained on the 80% training set (8,000 samples).</w:t>
       </w:r>
     </w:p>
     <w:p>
@@ -3398,7 +3413,7 @@
     <w:p/>
     <w:p>
       <w:r>
-        <w:t>Actual Results (from executed notebook, random_state=42):</w:t>
+        <w:t>Actual Results (dynamically evaluated, random_state=42):</w:t>
       </w:r>
     </w:p>
     <w:tbl>
@@ -3660,7 +3675,7 @@
         <w:t>MAE = $67.47: On average, predictions differ from actual Sales by $67.47.</w:t>
         <w:br/>
         <w:br/>
-        <w:t>Note: R² is NOT an accuracy percentage. R² = 0.9873 means the model explains 98.73% of variance. Accuracy is a classification metric and does not apply here.</w:t>
+        <w:t>Note on High R²: R² is a measure of variance explained, NOT an accuracy percentage. Because the synthetic dataset contains structured mathematical relationships between transaction attributes and Sales, model performance may be stronger than would be expected on noisy real-world retail data.</w:t>
       </w:r>
     </w:p>
     <w:p>
@@ -3668,21 +3683,15 @@
         <w:pStyle w:val="Heading1"/>
       </w:pPr>
       <w:r>
-        <w:t>16. Predictive Results</w:t>
+        <w:t>16. Per-Order Sales Prediction</w:t>
       </w:r>
     </w:p>
     <w:p>
       <w:r>
-        <w:t>The trained Pipeline was used to demonstrate per-order Sales predictions for five sample orders with different category, region, quantity, discount, and price combinations. The Pipeline automatically applied the preprocessing steps (passthrough for numerical features, OneHotEncoding for categorical features) before generating predictions.</w:t>
+        <w:t>The trained Pipeline was used to demonstrate per-order Sales predictions for sample order configurations. The Pipeline automatically applies the preprocessing steps (passthrough for numerical features, OneHotEncoding for categorical features) before generating predictions.</w:t>
         <w:br/>
         <w:br/>
-        <w:t>Sample predictions confirmed that:</w:t>
-        <w:br/>
-        <w:t>- Higher-priced Technology orders predict significantly higher Sales</w:t>
-        <w:br/>
-        <w:t>- Higher discount rates tend to reduce predicted Sales (as expected from the model's learned patterns)</w:t>
-        <w:br/>
-        <w:t>- The model generalises correctly to unseen order configurations</w:t>
+        <w:t>Sample predictions confirm that the model appropriately reflects unit price, quantity, discount level, and seasonal patterns when estimating transaction sales value.</w:t>
       </w:r>
     </w:p>
     <w:p>
@@ -3698,7 +3707,7 @@
         <w:t>The project includes a local, rule-based Automated Business Insight Engine implemented in Python. No external AI API (ChatGPT, Gemini, IBM Watson, etc.) is used or required.</w:t>
         <w:br/>
         <w:br/>
-        <w:t>The engine programmatically reads the actual computed metrics and generates structured natural-language business observations. The following insights were generated:</w:t>
+        <w:t>The engine programmatically reads the actual computed metrics and generates structured natural-language business observations:</w:t>
         <w:br/>
       </w:r>
     </w:p>
@@ -3729,7 +3738,7 @@
     </w:p>
     <w:p>
       <w:r>
-        <w:t>• [6] Discount–Profit correlation = -0.155. Orders at or above 30% discount show 45.2% lower average profit.</w:t>
+        <w:t>• [6] Discount–Profit correlation = -0.155 (negative). Orders at or above 30% discount show 45.2% lower average profit.</w:t>
       </w:r>
     </w:p>
     <w:p>
@@ -4422,27 +4431,27 @@
     </w:p>
     <w:p>
       <w:r>
-        <w:t>• Dataset is synthetic and may not capture all real-world complexities.</w:t>
+        <w:t>• Dataset is synthetic and contains structured relationships; model performance on noisy real-world data may vary.</w:t>
       </w:r>
     </w:p>
     <w:p>
       <w:r>
-        <w:t>• No external economic factors (inflation, market conditions) are modelled.</w:t>
+        <w:t>• No external economic factors (inflation, interest rates, market competitors) are modelled.</w:t>
       </w:r>
     </w:p>
     <w:p>
       <w:r>
-        <w:t>• Static batch analysis — no real-time data ingestion.</w:t>
+        <w:t>• Static batch analysis — no real-time data streaming.</w:t>
       </w:r>
     </w:p>
     <w:p>
       <w:r>
-        <w:t>• Per-order prediction only; dedicated time-series forecasting (ARIMA, Prophet) is future scope.</w:t>
+        <w:t>• Per-order prediction only; dedicated time-series forecasting (ARIMA, Prophet) is identified as future scope.</w:t>
       </w:r>
     </w:p>
     <w:p>
       <w:r>
-        <w:t>• Default hyperparameters used — tuning with GridSearchCV could improve performance.</w:t>
+        <w:t>• Default hyperparameters used — tuning with GridSearchCV could improve model stability.</w:t>
       </w:r>
     </w:p>
     <w:p>

</xml_diff>